<commit_message>
Update Dataset 2 analyses to use full data, ignore large wide features, and update findings
</commit_message>
<xml_diff>
--- a/Findings/Ablation_Study_Conclusions.docx
+++ b/Findings/Ablation_Study_Conclusions.docx
@@ -128,7 +128,7 @@
           <w:color w:val="000000"/>
           <w:sz w:val="20"/>
         </w:rPr>
-        <w:t>In Dataset 2 (64 channels), ICA cleaning significantly degrades classification. Logistic Regression Accuracy drops from 0.63 to 0.59, and SVM Baseline collapses to chance level (0.50).</w:t>
+        <w:t>In Dataset 2 (64 channels), ICA cleaning slightly degrades SVM baseline accuracy from 0.67 to 0.62, while Logistic Regression accuracy remains stable, increasing slightly from 0.67 to 0.68.</w:t>
       </w:r>
     </w:p>
     <w:p>
@@ -151,7 +151,7 @@
           <w:color w:val="000000"/>
           <w:sz w:val="20"/>
         </w:rPr>
-        <w:t>This indicates that raw classifiers rely heavily on non-neural ocular (blink) or muscle artifacts that correlate with states (e.g., blinking less during focus). Cleaning with ICA removes this predictive artifact contamination, reducing classification performance but ensuring a cleaner neural baseline.</w:t>
+        <w:t>This indicates that while SVM shows a performance drop after ICA cleaning (likely due to the removal of muscle/ocular artifacts that correlate with task states), Logistic Regression is robust to these changes, suggesting that the model resolves distinct neural sources of focus and mind-wandering when trained on the full dataset.</w:t>
       </w:r>
     </w:p>
     <w:p>
@@ -227,7 +227,7 @@
           <w:color w:val="000000"/>
           <w:sz w:val="20"/>
         </w:rPr>
-        <w:t>Isolating Spectral features (Only Spectral) dramatically boosts classification. Logistic Regression Raw accuracy climbs from 0.63 (Baseline) to 0.74, and SVM Raw climbs to 0.67.</w:t>
+        <w:t>Isolating Spectral features (Only Spectral) slightly boosts SVM Raw accuracy from 0.67 to 0.69, but degrades Logistic Regression Raw accuracy from 0.67 to 0.60.</w:t>
       </w:r>
     </w:p>
     <w:p>
@@ -250,7 +250,7 @@
           <w:color w:val="000000"/>
           <w:sz w:val="20"/>
         </w:rPr>
-        <w:t>In denser channel montages, including time-domain, entropy, and complexity feature families introduces significant noise. Restricting traditional models to spectral-domain features solves the curse of dimensionality and overfits.</w:t>
+        <w:t>In denser channel montages with the full dataset, the baseline models are better able to utilize multi-domain features, and restricting the features to the spectral domain degrades the Logistic Regression model, though it still provides a small benefit to the SVM model.</w:t>
       </w:r>
     </w:p>
     <w:p>
@@ -310,7 +310,7 @@
           <w:color w:val="000000"/>
           <w:sz w:val="20"/>
         </w:rPr>
-        <w:t>Central &amp; Temporal (0.66 accuracy) and Posterior (0.67 accuracy) electrodes show the highest standalone classification power. Frontal electrodes alone are weaker (0.61 accuracy).</w:t>
+        <w:t>Under SVM Raw, Central &amp; Temporal (0.71 accuracy) and Posterior (0.70 accuracy) electrodes show the highest standalone classification power, while Anterior (Frontal) electrodes alone are weaker (0.69 accuracy).</w:t>
       </w:r>
     </w:p>
     <w:p>
@@ -393,7 +393,7 @@
           <w:color w:val="000000"/>
           <w:sz w:val="20"/>
         </w:rPr>
-        <w:t>Alpha band power is the overwhelming performance driver. Omitting Alpha (Omit Alpha) drops SVM Raw accuracy by 10.3% (0.72 to 0.61), whereas isolating Alpha (Only Alpha) recovers almost the entire baseline performance (0.71).</w:t>
+        <w:t>Alpha band power remains the key performance driver in the frequency bands. Omitting Alpha (Omit Alpha) drops SVM Raw accuracy from 0.65 to 0.59, whereas isolating Alpha (Only Alpha) recovers almost the entire bandwise baseline performance (0.64 accuracy vs. 0.65 baseline).</w:t>
       </w:r>
     </w:p>
     <w:p>
@@ -896,7 +896,7 @@
                 <w:color w:val="000000"/>
                 <w:sz w:val="16"/>
               </w:rPr>
-              <w:t>0.61/0.63</w:t>
+              <w:t>0.67/0.67</w:t>
             </w:r>
           </w:p>
         </w:tc>
@@ -914,7 +914,7 @@
                 <w:color w:val="000000"/>
                 <w:sz w:val="16"/>
               </w:rPr>
-              <w:t>0.50/0.61</w:t>
+              <w:t>0.62/0.65</w:t>
             </w:r>
           </w:p>
         </w:tc>
@@ -932,7 +932,7 @@
                 <w:color w:val="000000"/>
                 <w:sz w:val="16"/>
               </w:rPr>
-              <w:t>0.63/0.65</w:t>
+              <w:t>0.67/0.64</w:t>
             </w:r>
           </w:p>
         </w:tc>
@@ -950,7 +950,7 @@
                 <w:color w:val="000000"/>
                 <w:sz w:val="16"/>
               </w:rPr>
-              <w:t>0.59/0.63</w:t>
+              <w:t>0.68/0.63</w:t>
             </w:r>
           </w:p>
         </w:tc>
@@ -1075,7 +1075,7 @@
                 <w:color w:val="000000"/>
                 <w:sz w:val="16"/>
               </w:rPr>
-              <w:t>0.67/0.66</w:t>
+              <w:t>0.69/0.64</w:t>
             </w:r>
           </w:p>
         </w:tc>
@@ -1093,7 +1093,7 @@
                 <w:color w:val="000000"/>
                 <w:sz w:val="16"/>
               </w:rPr>
-              <w:t>0.57/0.59</w:t>
+              <w:t>0.61/0.60</w:t>
             </w:r>
           </w:p>
         </w:tc>
@@ -1111,7 +1111,7 @@
                 <w:color w:val="000000"/>
                 <w:sz w:val="16"/>
               </w:rPr>
-              <w:t>0.74/0.68</w:t>
+              <w:t>0.60/0.53</w:t>
             </w:r>
           </w:p>
         </w:tc>
@@ -1129,7 +1129,7 @@
                 <w:color w:val="000000"/>
                 <w:sz w:val="16"/>
               </w:rPr>
-              <w:t>0.69/0.60</w:t>
+              <w:t>0.55/0.47</w:t>
             </w:r>
           </w:p>
         </w:tc>
@@ -1254,7 +1254,7 @@
                 <w:color w:val="000000"/>
                 <w:sz w:val="16"/>
               </w:rPr>
-              <w:t>0.67/0.53</w:t>
+              <w:t>0.71/0.68</w:t>
             </w:r>
           </w:p>
         </w:tc>
@@ -1272,7 +1272,7 @@
                 <w:color w:val="000000"/>
                 <w:sz w:val="16"/>
               </w:rPr>
-              <w:t>0.55/0.60</w:t>
+              <w:t>0.60/0.58</w:t>
             </w:r>
           </w:p>
         </w:tc>
@@ -1290,7 +1290,7 @@
                 <w:color w:val="000000"/>
                 <w:sz w:val="16"/>
               </w:rPr>
-              <w:t>0.66/0.67</w:t>
+              <w:t>0.64/0.63</w:t>
             </w:r>
           </w:p>
         </w:tc>
@@ -1308,7 +1308,7 @@
                 <w:color w:val="000000"/>
                 <w:sz w:val="16"/>
               </w:rPr>
-              <w:t>0.59/0.63</w:t>
+              <w:t>0.63/0.60</w:t>
             </w:r>
           </w:p>
         </w:tc>
@@ -1433,7 +1433,7 @@
                 <w:color w:val="000000"/>
                 <w:sz w:val="16"/>
               </w:rPr>
-              <w:t>0.59/0.62</w:t>
+              <w:t>0.70/0.67</w:t>
             </w:r>
           </w:p>
         </w:tc>
@@ -1451,7 +1451,7 @@
                 <w:color w:val="000000"/>
                 <w:sz w:val="16"/>
               </w:rPr>
-              <w:t>0.57/0.63</w:t>
+              <w:t>0.60/0.63</w:t>
             </w:r>
           </w:p>
         </w:tc>
@@ -1469,7 +1469,7 @@
                 <w:color w:val="000000"/>
                 <w:sz w:val="16"/>
               </w:rPr>
-              <w:t>0.67/0.60</w:t>
+              <w:t>0.67/0.63</w:t>
             </w:r>
           </w:p>
         </w:tc>
@@ -1487,7 +1487,7 @@
                 <w:color w:val="000000"/>
                 <w:sz w:val="16"/>
               </w:rPr>
-              <w:t>0.62/0.56</w:t>
+              <w:t>0.62/0.61</w:t>
             </w:r>
           </w:p>
         </w:tc>
@@ -1612,7 +1612,7 @@
                 <w:color w:val="000000"/>
                 <w:sz w:val="16"/>
               </w:rPr>
-              <w:t>0.71/0.58</w:t>
+              <w:t>0.65/0.59</w:t>
             </w:r>
           </w:p>
         </w:tc>
@@ -1630,7 +1630,7 @@
                 <w:color w:val="000000"/>
                 <w:sz w:val="16"/>
               </w:rPr>
-              <w:t>0.70/0.56</w:t>
+              <w:t>0.62/0.56</w:t>
             </w:r>
           </w:p>
         </w:tc>
@@ -1648,7 +1648,7 @@
                 <w:color w:val="000000"/>
                 <w:sz w:val="16"/>
               </w:rPr>
-              <w:t>0.67/0.46</w:t>
+              <w:t>0.62/0.42</w:t>
             </w:r>
           </w:p>
         </w:tc>
@@ -1666,7 +1666,7 @@
                 <w:color w:val="000000"/>
                 <w:sz w:val="16"/>
               </w:rPr>
-              <w:t>0.62/0.41</w:t>
+              <w:t>0.61/0.43</w:t>
             </w:r>
           </w:p>
         </w:tc>
@@ -1791,7 +1791,7 @@
                 <w:color w:val="000000"/>
                 <w:sz w:val="16"/>
               </w:rPr>
-              <w:t>0.61/0.50</w:t>
+              <w:t>0.59/0.56</w:t>
             </w:r>
           </w:p>
         </w:tc>
@@ -1809,7 +1809,7 @@
                 <w:color w:val="000000"/>
                 <w:sz w:val="16"/>
               </w:rPr>
-              <w:t>0.59/0.45</w:t>
+              <w:t>0.56/0.48</w:t>
             </w:r>
           </w:p>
         </w:tc>
@@ -1827,7 +1827,7 @@
                 <w:color w:val="000000"/>
                 <w:sz w:val="16"/>
               </w:rPr>
-              <w:t>0.62/0.35</w:t>
+              <w:t>0.59/0.44</w:t>
             </w:r>
           </w:p>
         </w:tc>
@@ -1845,7 +1845,7 @@
                 <w:color w:val="000000"/>
                 <w:sz w:val="16"/>
               </w:rPr>
-              <w:t>0.60/0.42</w:t>
+              <w:t>0.57/0.41</w:t>
             </w:r>
           </w:p>
         </w:tc>
@@ -1970,7 +1970,7 @@
                 <w:color w:val="000000"/>
                 <w:sz w:val="16"/>
               </w:rPr>
-              <w:t>0.71/0.56</w:t>
+              <w:t>0.64/0.54</w:t>
             </w:r>
           </w:p>
         </w:tc>
@@ -1988,7 +1988,7 @@
                 <w:color w:val="000000"/>
                 <w:sz w:val="16"/>
               </w:rPr>
-              <w:t>0.64/0.55</w:t>
+              <w:t>0.59/0.53</w:t>
             </w:r>
           </w:p>
         </w:tc>
@@ -2006,7 +2006,7 @@
                 <w:color w:val="000000"/>
                 <w:sz w:val="16"/>
               </w:rPr>
-              <w:t>0.62/0.54</w:t>
+              <w:t>0.62/0.56</w:t>
             </w:r>
           </w:p>
         </w:tc>
@@ -2024,7 +2024,7 @@
                 <w:color w:val="000000"/>
                 <w:sz w:val="16"/>
               </w:rPr>
-              <w:t>0.59/0.55</w:t>
+              <w:t>0.57/0.53</w:t>
             </w:r>
           </w:p>
         </w:tc>
@@ -2149,7 +2149,7 @@
                 <w:color w:val="000000"/>
                 <w:sz w:val="16"/>
               </w:rPr>
-              <w:t>0.55/0.52</w:t>
+              <w:t>0.57/0.54</w:t>
             </w:r>
           </w:p>
         </w:tc>
@@ -2167,7 +2167,7 @@
                 <w:color w:val="000000"/>
                 <w:sz w:val="16"/>
               </w:rPr>
-              <w:t>0.54/0.49</w:t>
+              <w:t>0.54/0.46</w:t>
             </w:r>
           </w:p>
         </w:tc>
@@ -2185,7 +2185,7 @@
                 <w:color w:val="000000"/>
                 <w:sz w:val="16"/>
               </w:rPr>
-              <w:t>0.58/0.39</w:t>
+              <w:t>0.56/0.54</w:t>
             </w:r>
           </w:p>
         </w:tc>
@@ -2203,7 +2203,7 @@
                 <w:color w:val="000000"/>
                 <w:sz w:val="16"/>
               </w:rPr>
-              <w:t>0.59/0.50</w:t>
+              <w:t>0.55/0.50</w:t>
             </w:r>
           </w:p>
         </w:tc>

</xml_diff>

<commit_message>
Update classification metrics, ablation results, findings docs, and overleaf paper code with 35-feature extended set
</commit_message>
<xml_diff>
--- a/Findings/Ablation_Study_Conclusions.docx
+++ b/Findings/Ablation_Study_Conclusions.docx
@@ -59,53 +59,7 @@
         <w:spacing w:after="60"/>
       </w:pPr>
       <w:r>
-        <w:rPr>
-          <w:rFonts w:ascii="Arial" w:hAnsi="Arial"/>
-          <w:b/>
-          <w:color w:val="000000"/>
-          <w:sz w:val="20"/>
-        </w:rPr>
-        <w:t xml:space="preserve">Dataset 1: </w:t>
-      </w:r>
-      <w:r>
-        <w:rPr>
-          <w:rFonts w:ascii="Arial" w:hAnsi="Arial"/>
-          <w:color w:val="000000"/>
-          <w:sz w:val="20"/>
-        </w:rPr>
-        <w:t>In Dataset 1 (19 channels), ICA cleaning has negligible impact on classification accuracy (SVM Baseline Raw: 0.60</w:t>
-      </w:r>
-      <w:r>
-        <w:rPr>
-          <w:rFonts w:ascii="Arial" w:hAnsi="Arial"/>
-          <w:color w:val="000000"/>
-          <w:sz w:val="20"/>
-        </w:rPr>
-        <w:t>4</w:t>
-      </w:r>
-      <w:r>
-        <w:rPr>
-          <w:rFonts w:ascii="Arial" w:hAnsi="Arial"/>
-          <w:color w:val="000000"/>
-          <w:sz w:val="20"/>
-        </w:rPr>
-        <w:t xml:space="preserve"> vs. Cleaned: 0.60</w:t>
-      </w:r>
-      <w:r>
-        <w:rPr>
-          <w:rFonts w:ascii="Arial" w:hAnsi="Arial"/>
-          <w:color w:val="000000"/>
-          <w:sz w:val="20"/>
-        </w:rPr>
-        <w:t>2</w:t>
-      </w:r>
-      <w:r>
-        <w:rPr>
-          <w:rFonts w:ascii="Arial" w:hAnsi="Arial"/>
-          <w:color w:val="000000"/>
-          <w:sz w:val="20"/>
-        </w:rPr>
-        <w:t>).</w:t>
+        <w:t>Dataset 1: In Dataset 1 (19 channels), ICA cleaning has negligible impact on classification accuracy (SVM Baseline Raw: 0.609 vs. Cleaned: 0.618).</w:t>
       </w:r>
     </w:p>
     <w:p>
@@ -114,21 +68,7 @@
         <w:spacing w:after="60"/>
       </w:pPr>
       <w:r>
-        <w:rPr>
-          <w:rFonts w:ascii="Arial" w:hAnsi="Arial"/>
-          <w:b/>
-          <w:color w:val="000000"/>
-          <w:sz w:val="20"/>
-        </w:rPr>
-        <w:t xml:space="preserve">Dataset 2: </w:t>
-      </w:r>
-      <w:r>
-        <w:rPr>
-          <w:rFonts w:ascii="Arial" w:hAnsi="Arial"/>
-          <w:color w:val="000000"/>
-          <w:sz w:val="20"/>
-        </w:rPr>
-        <w:t>In Dataset 2 (64 channels), ICA cleaning slightly degrades SVM baseline accuracy from 0.67 to 0.62, while Logistic Regression accuracy remains stable, increasing slightly from 0.67 to 0.68.</w:t>
+        <w:t>Dataset 2: In Dataset 2 (64 channels), ICA cleaning degrades SVM baseline accuracy from 0.75 to 0.68, while Logistic Regression accuracy increases from 0.75 to 0.76.</w:t>
       </w:r>
     </w:p>
     <w:p>
@@ -213,21 +153,7 @@
         <w:spacing w:after="60"/>
       </w:pPr>
       <w:r>
-        <w:rPr>
-          <w:rFonts w:ascii="Arial" w:hAnsi="Arial"/>
-          <w:b/>
-          <w:color w:val="000000"/>
-          <w:sz w:val="20"/>
-        </w:rPr>
-        <w:t xml:space="preserve">Dataset 2: </w:t>
-      </w:r>
-      <w:r>
-        <w:rPr>
-          <w:rFonts w:ascii="Arial" w:hAnsi="Arial"/>
-          <w:color w:val="000000"/>
-          <w:sz w:val="20"/>
-        </w:rPr>
-        <w:t>Isolating Spectral features (Only Spectral) slightly boosts SVM Raw accuracy from 0.67 to 0.69, but degrades Logistic Regression Raw accuracy from 0.67 to 0.60.</w:t>
+        <w:t>Dataset 2: Isolating Spectral features (Only Spectral) drops SVM Raw accuracy from 0.75 to 0.71, and degrades Logistic Regression Raw accuracy from 0.75 to 0.65.</w:t>
       </w:r>
     </w:p>
     <w:p>
@@ -296,21 +222,7 @@
         <w:spacing w:after="60"/>
       </w:pPr>
       <w:r>
-        <w:rPr>
-          <w:rFonts w:ascii="Arial" w:hAnsi="Arial"/>
-          <w:b/>
-          <w:color w:val="000000"/>
-          <w:sz w:val="20"/>
-        </w:rPr>
-        <w:t xml:space="preserve">Dataset 2: </w:t>
-      </w:r>
-      <w:r>
-        <w:rPr>
-          <w:rFonts w:ascii="Arial" w:hAnsi="Arial"/>
-          <w:color w:val="000000"/>
-          <w:sz w:val="20"/>
-        </w:rPr>
-        <w:t>Under SVM Raw, Central &amp; Temporal (0.71 accuracy) and Posterior (0.70 accuracy) electrodes show the highest standalone classification power, while Anterior (Frontal) electrodes alone are weaker (0.69 accuracy).</w:t>
+        <w:t>Dataset 2: Under SVM Raw, Anterior (Frontal) (0.76 accuracy) and Central &amp; Temporal (0.75 accuracy) electrodes show the highest standalone classification power, while Posterior electrodes alone are weaker (0.71 accuracy).</w:t>
       </w:r>
     </w:p>
     <w:p>
@@ -815,16 +727,8 @@
             <w:tcW w:w="1080" w:type="dxa"/>
           </w:tcPr>
           <w:p>
-            <w:pPr>
-              <w:jc w:val="center"/>
-            </w:pPr>
             <w:r>
-              <w:rPr>
-                <w:rFonts w:ascii="Arial" w:hAnsi="Arial"/>
-                <w:color w:val="000000"/>
-                <w:sz w:val="16"/>
-              </w:rPr>
-              <w:t>0.60/0.55</w:t>
+              <w:t>0.61/0.54</w:t>
             </w:r>
           </w:p>
         </w:tc>
@@ -833,16 +737,8 @@
             <w:tcW w:w="1080" w:type="dxa"/>
           </w:tcPr>
           <w:p>
-            <w:pPr>
-              <w:jc w:val="center"/>
-            </w:pPr>
             <w:r>
-              <w:rPr>
-                <w:rFonts w:ascii="Arial" w:hAnsi="Arial"/>
-                <w:color w:val="000000"/>
-                <w:sz w:val="16"/>
-              </w:rPr>
-              <w:t>0.60/0.55</w:t>
+              <w:t>0.62/0.55</w:t>
             </w:r>
           </w:p>
         </w:tc>
@@ -851,16 +747,8 @@
             <w:tcW w:w="1080" w:type="dxa"/>
           </w:tcPr>
           <w:p>
-            <w:pPr>
-              <w:jc w:val="center"/>
-            </w:pPr>
             <w:r>
-              <w:rPr>
-                <w:rFonts w:ascii="Arial" w:hAnsi="Arial"/>
-                <w:color w:val="000000"/>
-                <w:sz w:val="16"/>
-              </w:rPr>
-              <w:t>0.58/0.54</w:t>
+              <w:t>0.57/0.51</w:t>
             </w:r>
           </w:p>
         </w:tc>
@@ -869,16 +757,8 @@
             <w:tcW w:w="1080" w:type="dxa"/>
           </w:tcPr>
           <w:p>
-            <w:pPr>
-              <w:jc w:val="center"/>
-            </w:pPr>
             <w:r>
-              <w:rPr>
-                <w:rFonts w:ascii="Arial" w:hAnsi="Arial"/>
-                <w:color w:val="000000"/>
-                <w:sz w:val="16"/>
-              </w:rPr>
-              <w:t>0.58/0.55</w:t>
+              <w:t>0.56/0.51</w:t>
             </w:r>
           </w:p>
         </w:tc>
@@ -887,16 +767,8 @@
             <w:tcW w:w="1080" w:type="dxa"/>
           </w:tcPr>
           <w:p>
-            <w:pPr>
-              <w:jc w:val="center"/>
-            </w:pPr>
             <w:r>
-              <w:rPr>
-                <w:rFonts w:ascii="Arial" w:hAnsi="Arial"/>
-                <w:color w:val="000000"/>
-                <w:sz w:val="16"/>
-              </w:rPr>
-              <w:t>0.67/0.67</w:t>
+              <w:t>0.75/0.73</w:t>
             </w:r>
           </w:p>
         </w:tc>
@@ -905,16 +777,8 @@
             <w:tcW w:w="1080" w:type="dxa"/>
           </w:tcPr>
           <w:p>
-            <w:pPr>
-              <w:jc w:val="center"/>
-            </w:pPr>
             <w:r>
-              <w:rPr>
-                <w:rFonts w:ascii="Arial" w:hAnsi="Arial"/>
-                <w:color w:val="000000"/>
-                <w:sz w:val="16"/>
-              </w:rPr>
-              <w:t>0.62/0.65</w:t>
+              <w:t>0.68/0.69</w:t>
             </w:r>
           </w:p>
         </w:tc>
@@ -923,16 +787,8 @@
             <w:tcW w:w="1080" w:type="dxa"/>
           </w:tcPr>
           <w:p>
-            <w:pPr>
-              <w:jc w:val="center"/>
-            </w:pPr>
             <w:r>
-              <w:rPr>
-                <w:rFonts w:ascii="Arial" w:hAnsi="Arial"/>
-                <w:color w:val="000000"/>
-                <w:sz w:val="16"/>
-              </w:rPr>
-              <w:t>0.67/0.64</w:t>
+              <w:t>0.75/0.71</w:t>
             </w:r>
           </w:p>
         </w:tc>
@@ -941,16 +797,8 @@
             <w:tcW w:w="1080" w:type="dxa"/>
           </w:tcPr>
           <w:p>
-            <w:pPr>
-              <w:jc w:val="center"/>
-            </w:pPr>
             <w:r>
-              <w:rPr>
-                <w:rFonts w:ascii="Arial" w:hAnsi="Arial"/>
-                <w:color w:val="000000"/>
-                <w:sz w:val="16"/>
-              </w:rPr>
-              <w:t>0.68/0.63</w:t>
+              <w:t>0.76/0.72</w:t>
             </w:r>
           </w:p>
         </w:tc>
@@ -994,16 +842,8 @@
             <w:tcW w:w="1080" w:type="dxa"/>
           </w:tcPr>
           <w:p>
-            <w:pPr>
-              <w:jc w:val="center"/>
-            </w:pPr>
             <w:r>
-              <w:rPr>
-                <w:rFonts w:ascii="Arial" w:hAnsi="Arial"/>
-                <w:color w:val="000000"/>
-                <w:sz w:val="16"/>
-              </w:rPr>
-              <w:t>0.55/0.54</w:t>
+              <w:t>0.61/0.53</w:t>
             </w:r>
           </w:p>
         </w:tc>
@@ -1012,105 +852,7 @@
             <w:tcW w:w="1080" w:type="dxa"/>
           </w:tcPr>
           <w:p>
-            <w:pPr>
-              <w:jc w:val="center"/>
-            </w:pPr>
             <w:r>
-              <w:rPr>
-                <w:rFonts w:ascii="Arial" w:hAnsi="Arial"/>
-                <w:color w:val="000000"/>
-                <w:sz w:val="16"/>
-              </w:rPr>
-              <w:t>0.56/0.57</w:t>
-            </w:r>
-          </w:p>
-        </w:tc>
-        <w:tc>
-          <w:tcPr>
-            <w:tcW w:w="1080" w:type="dxa"/>
-          </w:tcPr>
-          <w:p>
-            <w:pPr>
-              <w:jc w:val="center"/>
-            </w:pPr>
-            <w:r>
-              <w:rPr>
-                <w:rFonts w:ascii="Arial" w:hAnsi="Arial"/>
-                <w:color w:val="000000"/>
-                <w:sz w:val="16"/>
-              </w:rPr>
-              <w:t>0.54/0.55</w:t>
-            </w:r>
-          </w:p>
-        </w:tc>
-        <w:tc>
-          <w:tcPr>
-            <w:tcW w:w="1080" w:type="dxa"/>
-          </w:tcPr>
-          <w:p>
-            <w:pPr>
-              <w:jc w:val="center"/>
-            </w:pPr>
-            <w:r>
-              <w:rPr>
-                <w:rFonts w:ascii="Arial" w:hAnsi="Arial"/>
-                <w:color w:val="000000"/>
-                <w:sz w:val="16"/>
-              </w:rPr>
-              <w:t>0.53/0.55</w:t>
-            </w:r>
-          </w:p>
-        </w:tc>
-        <w:tc>
-          <w:tcPr>
-            <w:tcW w:w="1080" w:type="dxa"/>
-          </w:tcPr>
-          <w:p>
-            <w:pPr>
-              <w:jc w:val="center"/>
-            </w:pPr>
-            <w:r>
-              <w:rPr>
-                <w:rFonts w:ascii="Arial" w:hAnsi="Arial"/>
-                <w:color w:val="000000"/>
-                <w:sz w:val="16"/>
-              </w:rPr>
-              <w:t>0.69/0.64</w:t>
-            </w:r>
-          </w:p>
-        </w:tc>
-        <w:tc>
-          <w:tcPr>
-            <w:tcW w:w="1080" w:type="dxa"/>
-          </w:tcPr>
-          <w:p>
-            <w:pPr>
-              <w:jc w:val="center"/>
-            </w:pPr>
-            <w:r>
-              <w:rPr>
-                <w:rFonts w:ascii="Arial" w:hAnsi="Arial"/>
-                <w:color w:val="000000"/>
-                <w:sz w:val="16"/>
-              </w:rPr>
-              <w:t>0.61/0.60</w:t>
-            </w:r>
-          </w:p>
-        </w:tc>
-        <w:tc>
-          <w:tcPr>
-            <w:tcW w:w="1080" w:type="dxa"/>
-          </w:tcPr>
-          <w:p>
-            <w:pPr>
-              <w:jc w:val="center"/>
-            </w:pPr>
-            <w:r>
-              <w:rPr>
-                <w:rFonts w:ascii="Arial" w:hAnsi="Arial"/>
-                <w:color w:val="000000"/>
-                <w:sz w:val="16"/>
-              </w:rPr>
               <w:t>0.60/0.53</w:t>
             </w:r>
           </w:p>
@@ -1120,16 +862,58 @@
             <w:tcW w:w="1080" w:type="dxa"/>
           </w:tcPr>
           <w:p>
-            <w:pPr>
-              <w:jc w:val="center"/>
-            </w:pPr>
             <w:r>
-              <w:rPr>
-                <w:rFonts w:ascii="Arial" w:hAnsi="Arial"/>
-                <w:color w:val="000000"/>
-                <w:sz w:val="16"/>
-              </w:rPr>
-              <w:t>0.55/0.47</w:t>
+              <w:t>0.60/0.56</w:t>
+            </w:r>
+          </w:p>
+        </w:tc>
+        <w:tc>
+          <w:tcPr>
+            <w:tcW w:w="1080" w:type="dxa"/>
+          </w:tcPr>
+          <w:p>
+            <w:r>
+              <w:t>0.59/0.56</w:t>
+            </w:r>
+          </w:p>
+        </w:tc>
+        <w:tc>
+          <w:tcPr>
+            <w:tcW w:w="1080" w:type="dxa"/>
+          </w:tcPr>
+          <w:p>
+            <w:r>
+              <w:t>0.71/0.68</w:t>
+            </w:r>
+          </w:p>
+        </w:tc>
+        <w:tc>
+          <w:tcPr>
+            <w:tcW w:w="1080" w:type="dxa"/>
+          </w:tcPr>
+          <w:p>
+            <w:r>
+              <w:t>0.67/0.67</w:t>
+            </w:r>
+          </w:p>
+        </w:tc>
+        <w:tc>
+          <w:tcPr>
+            <w:tcW w:w="1080" w:type="dxa"/>
+          </w:tcPr>
+          <w:p>
+            <w:r>
+              <w:t>0.65/0.59</w:t>
+            </w:r>
+          </w:p>
+        </w:tc>
+        <w:tc>
+          <w:tcPr>
+            <w:tcW w:w="1080" w:type="dxa"/>
+          </w:tcPr>
+          <w:p>
+            <w:r>
+              <w:t>0.68/0.57</w:t>
             </w:r>
           </w:p>
         </w:tc>
@@ -1173,16 +957,8 @@
             <w:tcW w:w="1080" w:type="dxa"/>
           </w:tcPr>
           <w:p>
-            <w:pPr>
-              <w:jc w:val="center"/>
-            </w:pPr>
             <w:r>
-              <w:rPr>
-                <w:rFonts w:ascii="Arial" w:hAnsi="Arial"/>
-                <w:color w:val="000000"/>
-                <w:sz w:val="16"/>
-              </w:rPr>
-              <w:t>0.61/0.54</w:t>
+              <w:t>0.62/0.55</w:t>
             </w:r>
           </w:p>
         </w:tc>
@@ -1191,16 +967,8 @@
             <w:tcW w:w="1080" w:type="dxa"/>
           </w:tcPr>
           <w:p>
-            <w:pPr>
-              <w:jc w:val="center"/>
-            </w:pPr>
             <w:r>
-              <w:rPr>
-                <w:rFonts w:ascii="Arial" w:hAnsi="Arial"/>
-                <w:color w:val="000000"/>
-                <w:sz w:val="16"/>
-              </w:rPr>
-              <w:t>0.61/0.54</w:t>
+              <w:t>0.62/0.56</w:t>
             </w:r>
           </w:p>
         </w:tc>
@@ -1209,15 +977,7 @@
             <w:tcW w:w="1080" w:type="dxa"/>
           </w:tcPr>
           <w:p>
-            <w:pPr>
-              <w:jc w:val="center"/>
-            </w:pPr>
             <w:r>
-              <w:rPr>
-                <w:rFonts w:ascii="Arial" w:hAnsi="Arial"/>
-                <w:color w:val="000000"/>
-                <w:sz w:val="16"/>
-              </w:rPr>
               <w:t>0.58/0.54</w:t>
             </w:r>
           </w:p>
@@ -1227,16 +987,8 @@
             <w:tcW w:w="1080" w:type="dxa"/>
           </w:tcPr>
           <w:p>
-            <w:pPr>
-              <w:jc w:val="center"/>
-            </w:pPr>
             <w:r>
-              <w:rPr>
-                <w:rFonts w:ascii="Arial" w:hAnsi="Arial"/>
-                <w:color w:val="000000"/>
-                <w:sz w:val="16"/>
-              </w:rPr>
-              <w:t>0.58/0.54</w:t>
+              <w:t>0.58/0.55</w:t>
             </w:r>
           </w:p>
         </w:tc>
@@ -1245,16 +997,8 @@
             <w:tcW w:w="1080" w:type="dxa"/>
           </w:tcPr>
           <w:p>
-            <w:pPr>
-              <w:jc w:val="center"/>
-            </w:pPr>
             <w:r>
-              <w:rPr>
-                <w:rFonts w:ascii="Arial" w:hAnsi="Arial"/>
-                <w:color w:val="000000"/>
-                <w:sz w:val="16"/>
-              </w:rPr>
-              <w:t>0.71/0.68</w:t>
+              <w:t>0.75/0.72</w:t>
             </w:r>
           </w:p>
         </w:tc>
@@ -1263,16 +1007,8 @@
             <w:tcW w:w="1080" w:type="dxa"/>
           </w:tcPr>
           <w:p>
-            <w:pPr>
-              <w:jc w:val="center"/>
-            </w:pPr>
             <w:r>
-              <w:rPr>
-                <w:rFonts w:ascii="Arial" w:hAnsi="Arial"/>
-                <w:color w:val="000000"/>
-                <w:sz w:val="16"/>
-              </w:rPr>
-              <w:t>0.60/0.58</w:t>
+              <w:t>0.66/0.64</w:t>
             </w:r>
           </w:p>
         </w:tc>
@@ -1281,16 +1017,8 @@
             <w:tcW w:w="1080" w:type="dxa"/>
           </w:tcPr>
           <w:p>
-            <w:pPr>
-              <w:jc w:val="center"/>
-            </w:pPr>
             <w:r>
-              <w:rPr>
-                <w:rFonts w:ascii="Arial" w:hAnsi="Arial"/>
-                <w:color w:val="000000"/>
-                <w:sz w:val="16"/>
-              </w:rPr>
-              <w:t>0.64/0.63</w:t>
+              <w:t>0.70/0.65</w:t>
             </w:r>
           </w:p>
         </w:tc>
@@ -1299,16 +1027,8 @@
             <w:tcW w:w="1080" w:type="dxa"/>
           </w:tcPr>
           <w:p>
-            <w:pPr>
-              <w:jc w:val="center"/>
-            </w:pPr>
             <w:r>
-              <w:rPr>
-                <w:rFonts w:ascii="Arial" w:hAnsi="Arial"/>
-                <w:color w:val="000000"/>
-                <w:sz w:val="16"/>
-              </w:rPr>
-              <w:t>0.63/0.60</w:t>
+              <w:t>0.70/0.65</w:t>
             </w:r>
           </w:p>
         </w:tc>
@@ -1352,16 +1072,8 @@
             <w:tcW w:w="1080" w:type="dxa"/>
           </w:tcPr>
           <w:p>
-            <w:pPr>
-              <w:jc w:val="center"/>
-            </w:pPr>
             <w:r>
-              <w:rPr>
-                <w:rFonts w:ascii="Arial" w:hAnsi="Arial"/>
-                <w:color w:val="000000"/>
-                <w:sz w:val="16"/>
-              </w:rPr>
-              <w:t>0.58/0.51</w:t>
+              <w:t>0.57/0.49</w:t>
             </w:r>
           </w:p>
         </w:tc>
@@ -1370,16 +1082,8 @@
             <w:tcW w:w="1080" w:type="dxa"/>
           </w:tcPr>
           <w:p>
-            <w:pPr>
-              <w:jc w:val="center"/>
-            </w:pPr>
             <w:r>
-              <w:rPr>
-                <w:rFonts w:ascii="Arial" w:hAnsi="Arial"/>
-                <w:color w:val="000000"/>
-                <w:sz w:val="16"/>
-              </w:rPr>
-              <w:t>0.58/0.52</w:t>
+              <w:t>0.58/0.50</w:t>
             </w:r>
           </w:p>
         </w:tc>
@@ -1388,16 +1092,8 @@
             <w:tcW w:w="1080" w:type="dxa"/>
           </w:tcPr>
           <w:p>
-            <w:pPr>
-              <w:jc w:val="center"/>
-            </w:pPr>
             <w:r>
-              <w:rPr>
-                <w:rFonts w:ascii="Arial" w:hAnsi="Arial"/>
-                <w:color w:val="000000"/>
-                <w:sz w:val="16"/>
-              </w:rPr>
-              <w:t>0.55/0.50</w:t>
+              <w:t>0.57/0.53</w:t>
             </w:r>
           </w:p>
         </w:tc>
@@ -1406,16 +1102,8 @@
             <w:tcW w:w="1080" w:type="dxa"/>
           </w:tcPr>
           <w:p>
-            <w:pPr>
-              <w:jc w:val="center"/>
-            </w:pPr>
             <w:r>
-              <w:rPr>
-                <w:rFonts w:ascii="Arial" w:hAnsi="Arial"/>
-                <w:color w:val="000000"/>
-                <w:sz w:val="16"/>
-              </w:rPr>
-              <w:t>0.55/0.50</w:t>
+              <w:t>0.57/0.53</w:t>
             </w:r>
           </w:p>
         </w:tc>
@@ -1424,16 +1112,8 @@
             <w:tcW w:w="1080" w:type="dxa"/>
           </w:tcPr>
           <w:p>
-            <w:pPr>
-              <w:jc w:val="center"/>
-            </w:pPr>
             <w:r>
-              <w:rPr>
-                <w:rFonts w:ascii="Arial" w:hAnsi="Arial"/>
-                <w:color w:val="000000"/>
-                <w:sz w:val="16"/>
-              </w:rPr>
-              <w:t>0.70/0.67</w:t>
+              <w:t>0.71/0.67</w:t>
             </w:r>
           </w:p>
         </w:tc>
@@ -1442,16 +1122,8 @@
             <w:tcW w:w="1080" w:type="dxa"/>
           </w:tcPr>
           <w:p>
-            <w:pPr>
-              <w:jc w:val="center"/>
-            </w:pPr>
             <w:r>
-              <w:rPr>
-                <w:rFonts w:ascii="Arial" w:hAnsi="Arial"/>
-                <w:color w:val="000000"/>
-                <w:sz w:val="16"/>
-              </w:rPr>
-              <w:t>0.60/0.63</w:t>
+              <w:t>0.67/0.67</w:t>
             </w:r>
           </w:p>
         </w:tc>
@@ -1460,16 +1132,8 @@
             <w:tcW w:w="1080" w:type="dxa"/>
           </w:tcPr>
           <w:p>
-            <w:pPr>
-              <w:jc w:val="center"/>
-            </w:pPr>
             <w:r>
-              <w:rPr>
-                <w:rFonts w:ascii="Arial" w:hAnsi="Arial"/>
-                <w:color w:val="000000"/>
-                <w:sz w:val="16"/>
-              </w:rPr>
-              <w:t>0.67/0.63</w:t>
+              <w:t>0.68/0.56</w:t>
             </w:r>
           </w:p>
         </w:tc>
@@ -1478,16 +1142,8 @@
             <w:tcW w:w="1080" w:type="dxa"/>
           </w:tcPr>
           <w:p>
-            <w:pPr>
-              <w:jc w:val="center"/>
-            </w:pPr>
             <w:r>
-              <w:rPr>
-                <w:rFonts w:ascii="Arial" w:hAnsi="Arial"/>
-                <w:color w:val="000000"/>
-                <w:sz w:val="16"/>
-              </w:rPr>
-              <w:t>0.62/0.61</w:t>
+              <w:t>0.63/0.60</w:t>
             </w:r>
           </w:p>
         </w:tc>
@@ -1531,15 +1187,7 @@
             <w:tcW w:w="1080" w:type="dxa"/>
           </w:tcPr>
           <w:p>
-            <w:pPr>
-              <w:jc w:val="center"/>
-            </w:pPr>
             <w:r>
-              <w:rPr>
-                <w:rFonts w:ascii="Arial" w:hAnsi="Arial"/>
-                <w:color w:val="000000"/>
-                <w:sz w:val="16"/>
-              </w:rPr>
               <w:t>0.59/0.53</w:t>
             </w:r>
           </w:p>
@@ -1549,15 +1197,7 @@
             <w:tcW w:w="1080" w:type="dxa"/>
           </w:tcPr>
           <w:p>
-            <w:pPr>
-              <w:jc w:val="center"/>
-            </w:pPr>
             <w:r>
-              <w:rPr>
-                <w:rFonts w:ascii="Arial" w:hAnsi="Arial"/>
-                <w:color w:val="000000"/>
-                <w:sz w:val="16"/>
-              </w:rPr>
               <w:t>0.60/0.53</w:t>
             </w:r>
           </w:p>
@@ -1567,15 +1207,7 @@
             <w:tcW w:w="1080" w:type="dxa"/>
           </w:tcPr>
           <w:p>
-            <w:pPr>
-              <w:jc w:val="center"/>
-            </w:pPr>
             <w:r>
-              <w:rPr>
-                <w:rFonts w:ascii="Arial" w:hAnsi="Arial"/>
-                <w:color w:val="000000"/>
-                <w:sz w:val="16"/>
-              </w:rPr>
               <w:t>0.59/0.55</w:t>
             </w:r>
           </w:p>
@@ -1585,15 +1217,7 @@
             <w:tcW w:w="1080" w:type="dxa"/>
           </w:tcPr>
           <w:p>
-            <w:pPr>
-              <w:jc w:val="center"/>
-            </w:pPr>
             <w:r>
-              <w:rPr>
-                <w:rFonts w:ascii="Arial" w:hAnsi="Arial"/>
-                <w:color w:val="000000"/>
-                <w:sz w:val="16"/>
-              </w:rPr>
               <w:t>0.59/0.56</w:t>
             </w:r>
           </w:p>
@@ -1603,15 +1227,7 @@
             <w:tcW w:w="1080" w:type="dxa"/>
           </w:tcPr>
           <w:p>
-            <w:pPr>
-              <w:jc w:val="center"/>
-            </w:pPr>
             <w:r>
-              <w:rPr>
-                <w:rFonts w:ascii="Arial" w:hAnsi="Arial"/>
-                <w:color w:val="000000"/>
-                <w:sz w:val="16"/>
-              </w:rPr>
               <w:t>0.65/0.59</w:t>
             </w:r>
           </w:p>
@@ -1621,15 +1237,7 @@
             <w:tcW w:w="1080" w:type="dxa"/>
           </w:tcPr>
           <w:p>
-            <w:pPr>
-              <w:jc w:val="center"/>
-            </w:pPr>
             <w:r>
-              <w:rPr>
-                <w:rFonts w:ascii="Arial" w:hAnsi="Arial"/>
-                <w:color w:val="000000"/>
-                <w:sz w:val="16"/>
-              </w:rPr>
               <w:t>0.62/0.56</w:t>
             </w:r>
           </w:p>
@@ -1639,15 +1247,7 @@
             <w:tcW w:w="1080" w:type="dxa"/>
           </w:tcPr>
           <w:p>
-            <w:pPr>
-              <w:jc w:val="center"/>
-            </w:pPr>
             <w:r>
-              <w:rPr>
-                <w:rFonts w:ascii="Arial" w:hAnsi="Arial"/>
-                <w:color w:val="000000"/>
-                <w:sz w:val="16"/>
-              </w:rPr>
               <w:t>0.62/0.42</w:t>
             </w:r>
           </w:p>
@@ -1657,15 +1257,7 @@
             <w:tcW w:w="1080" w:type="dxa"/>
           </w:tcPr>
           <w:p>
-            <w:pPr>
-              <w:jc w:val="center"/>
-            </w:pPr>
             <w:r>
-              <w:rPr>
-                <w:rFonts w:ascii="Arial" w:hAnsi="Arial"/>
-                <w:color w:val="000000"/>
-                <w:sz w:val="16"/>
-              </w:rPr>
               <w:t>0.61/0.43</w:t>
             </w:r>
           </w:p>
@@ -1710,15 +1302,7 @@
             <w:tcW w:w="1080" w:type="dxa"/>
           </w:tcPr>
           <w:p>
-            <w:pPr>
-              <w:jc w:val="center"/>
-            </w:pPr>
             <w:r>
-              <w:rPr>
-                <w:rFonts w:ascii="Arial" w:hAnsi="Arial"/>
-                <w:color w:val="000000"/>
-                <w:sz w:val="16"/>
-              </w:rPr>
               <w:t>0.59/0.52</w:t>
             </w:r>
           </w:p>
@@ -1728,15 +1312,7 @@
             <w:tcW w:w="1080" w:type="dxa"/>
           </w:tcPr>
           <w:p>
-            <w:pPr>
-              <w:jc w:val="center"/>
-            </w:pPr>
             <w:r>
-              <w:rPr>
-                <w:rFonts w:ascii="Arial" w:hAnsi="Arial"/>
-                <w:color w:val="000000"/>
-                <w:sz w:val="16"/>
-              </w:rPr>
               <w:t>0.60/0.54</w:t>
             </w:r>
           </w:p>
@@ -1746,15 +1322,7 @@
             <w:tcW w:w="1080" w:type="dxa"/>
           </w:tcPr>
           <w:p>
-            <w:pPr>
-              <w:jc w:val="center"/>
-            </w:pPr>
             <w:r>
-              <w:rPr>
-                <w:rFonts w:ascii="Arial" w:hAnsi="Arial"/>
-                <w:color w:val="000000"/>
-                <w:sz w:val="16"/>
-              </w:rPr>
               <w:t>0.59/0.56</w:t>
             </w:r>
           </w:p>
@@ -1764,15 +1332,7 @@
             <w:tcW w:w="1080" w:type="dxa"/>
           </w:tcPr>
           <w:p>
-            <w:pPr>
-              <w:jc w:val="center"/>
-            </w:pPr>
             <w:r>
-              <w:rPr>
-                <w:rFonts w:ascii="Arial" w:hAnsi="Arial"/>
-                <w:color w:val="000000"/>
-                <w:sz w:val="16"/>
-              </w:rPr>
               <w:t>0.58/0.56</w:t>
             </w:r>
           </w:p>
@@ -1782,15 +1342,7 @@
             <w:tcW w:w="1080" w:type="dxa"/>
           </w:tcPr>
           <w:p>
-            <w:pPr>
-              <w:jc w:val="center"/>
-            </w:pPr>
             <w:r>
-              <w:rPr>
-                <w:rFonts w:ascii="Arial" w:hAnsi="Arial"/>
-                <w:color w:val="000000"/>
-                <w:sz w:val="16"/>
-              </w:rPr>
               <w:t>0.59/0.56</w:t>
             </w:r>
           </w:p>
@@ -1800,15 +1352,7 @@
             <w:tcW w:w="1080" w:type="dxa"/>
           </w:tcPr>
           <w:p>
-            <w:pPr>
-              <w:jc w:val="center"/>
-            </w:pPr>
             <w:r>
-              <w:rPr>
-                <w:rFonts w:ascii="Arial" w:hAnsi="Arial"/>
-                <w:color w:val="000000"/>
-                <w:sz w:val="16"/>
-              </w:rPr>
               <w:t>0.56/0.48</w:t>
             </w:r>
           </w:p>
@@ -1818,15 +1362,7 @@
             <w:tcW w:w="1080" w:type="dxa"/>
           </w:tcPr>
           <w:p>
-            <w:pPr>
-              <w:jc w:val="center"/>
-            </w:pPr>
             <w:r>
-              <w:rPr>
-                <w:rFonts w:ascii="Arial" w:hAnsi="Arial"/>
-                <w:color w:val="000000"/>
-                <w:sz w:val="16"/>
-              </w:rPr>
               <w:t>0.59/0.44</w:t>
             </w:r>
           </w:p>
@@ -1836,15 +1372,7 @@
             <w:tcW w:w="1080" w:type="dxa"/>
           </w:tcPr>
           <w:p>
-            <w:pPr>
-              <w:jc w:val="center"/>
-            </w:pPr>
             <w:r>
-              <w:rPr>
-                <w:rFonts w:ascii="Arial" w:hAnsi="Arial"/>
-                <w:color w:val="000000"/>
-                <w:sz w:val="16"/>
-              </w:rPr>
               <w:t>0.57/0.41</w:t>
             </w:r>
           </w:p>
@@ -1889,15 +1417,7 @@
             <w:tcW w:w="1080" w:type="dxa"/>
           </w:tcPr>
           <w:p>
-            <w:pPr>
-              <w:jc w:val="center"/>
-            </w:pPr>
             <w:r>
-              <w:rPr>
-                <w:rFonts w:ascii="Arial" w:hAnsi="Arial"/>
-                <w:color w:val="000000"/>
-                <w:sz w:val="16"/>
-              </w:rPr>
               <w:t>0.55/0.52</w:t>
             </w:r>
           </w:p>
@@ -1907,15 +1427,7 @@
             <w:tcW w:w="1080" w:type="dxa"/>
           </w:tcPr>
           <w:p>
-            <w:pPr>
-              <w:jc w:val="center"/>
-            </w:pPr>
             <w:r>
-              <w:rPr>
-                <w:rFonts w:ascii="Arial" w:hAnsi="Arial"/>
-                <w:color w:val="000000"/>
-                <w:sz w:val="16"/>
-              </w:rPr>
               <w:t>0.55/0.50</w:t>
             </w:r>
           </w:p>
@@ -1925,15 +1437,7 @@
             <w:tcW w:w="1080" w:type="dxa"/>
           </w:tcPr>
           <w:p>
-            <w:pPr>
-              <w:jc w:val="center"/>
-            </w:pPr>
             <w:r>
-              <w:rPr>
-                <w:rFonts w:ascii="Arial" w:hAnsi="Arial"/>
-                <w:color w:val="000000"/>
-                <w:sz w:val="16"/>
-              </w:rPr>
               <w:t>0.55/0.54</w:t>
             </w:r>
           </w:p>
@@ -1943,15 +1447,7 @@
             <w:tcW w:w="1080" w:type="dxa"/>
           </w:tcPr>
           <w:p>
-            <w:pPr>
-              <w:jc w:val="center"/>
-            </w:pPr>
             <w:r>
-              <w:rPr>
-                <w:rFonts w:ascii="Arial" w:hAnsi="Arial"/>
-                <w:color w:val="000000"/>
-                <w:sz w:val="16"/>
-              </w:rPr>
               <w:t>0.56/0.54</w:t>
             </w:r>
           </w:p>
@@ -1961,15 +1457,7 @@
             <w:tcW w:w="1080" w:type="dxa"/>
           </w:tcPr>
           <w:p>
-            <w:pPr>
-              <w:jc w:val="center"/>
-            </w:pPr>
             <w:r>
-              <w:rPr>
-                <w:rFonts w:ascii="Arial" w:hAnsi="Arial"/>
-                <w:color w:val="000000"/>
-                <w:sz w:val="16"/>
-              </w:rPr>
               <w:t>0.64/0.54</w:t>
             </w:r>
           </w:p>
@@ -1979,15 +1467,7 @@
             <w:tcW w:w="1080" w:type="dxa"/>
           </w:tcPr>
           <w:p>
-            <w:pPr>
-              <w:jc w:val="center"/>
-            </w:pPr>
             <w:r>
-              <w:rPr>
-                <w:rFonts w:ascii="Arial" w:hAnsi="Arial"/>
-                <w:color w:val="000000"/>
-                <w:sz w:val="16"/>
-              </w:rPr>
               <w:t>0.59/0.53</w:t>
             </w:r>
           </w:p>
@@ -1997,15 +1477,7 @@
             <w:tcW w:w="1080" w:type="dxa"/>
           </w:tcPr>
           <w:p>
-            <w:pPr>
-              <w:jc w:val="center"/>
-            </w:pPr>
             <w:r>
-              <w:rPr>
-                <w:rFonts w:ascii="Arial" w:hAnsi="Arial"/>
-                <w:color w:val="000000"/>
-                <w:sz w:val="16"/>
-              </w:rPr>
               <w:t>0.62/0.56</w:t>
             </w:r>
           </w:p>
@@ -2015,15 +1487,7 @@
             <w:tcW w:w="1080" w:type="dxa"/>
           </w:tcPr>
           <w:p>
-            <w:pPr>
-              <w:jc w:val="center"/>
-            </w:pPr>
             <w:r>
-              <w:rPr>
-                <w:rFonts w:ascii="Arial" w:hAnsi="Arial"/>
-                <w:color w:val="000000"/>
-                <w:sz w:val="16"/>
-              </w:rPr>
               <w:t>0.57/0.53</w:t>
             </w:r>
           </w:p>
@@ -2068,15 +1532,7 @@
             <w:tcW w:w="1080" w:type="dxa"/>
           </w:tcPr>
           <w:p>
-            <w:pPr>
-              <w:jc w:val="center"/>
-            </w:pPr>
             <w:r>
-              <w:rPr>
-                <w:rFonts w:ascii="Arial" w:hAnsi="Arial"/>
-                <w:color w:val="000000"/>
-                <w:sz w:val="16"/>
-              </w:rPr>
               <w:t>0.59/0.52</w:t>
             </w:r>
           </w:p>
@@ -2086,15 +1542,7 @@
             <w:tcW w:w="1080" w:type="dxa"/>
           </w:tcPr>
           <w:p>
-            <w:pPr>
-              <w:jc w:val="center"/>
-            </w:pPr>
             <w:r>
-              <w:rPr>
-                <w:rFonts w:ascii="Arial" w:hAnsi="Arial"/>
-                <w:color w:val="000000"/>
-                <w:sz w:val="16"/>
-              </w:rPr>
               <w:t>0.59/0.49</w:t>
             </w:r>
           </w:p>
@@ -2104,15 +1552,7 @@
             <w:tcW w:w="1080" w:type="dxa"/>
           </w:tcPr>
           <w:p>
-            <w:pPr>
-              <w:jc w:val="center"/>
-            </w:pPr>
             <w:r>
-              <w:rPr>
-                <w:rFonts w:ascii="Arial" w:hAnsi="Arial"/>
-                <w:color w:val="000000"/>
-                <w:sz w:val="16"/>
-              </w:rPr>
               <w:t>0.57/0.53</w:t>
             </w:r>
           </w:p>
@@ -2122,15 +1562,7 @@
             <w:tcW w:w="1080" w:type="dxa"/>
           </w:tcPr>
           <w:p>
-            <w:pPr>
-              <w:jc w:val="center"/>
-            </w:pPr>
             <w:r>
-              <w:rPr>
-                <w:rFonts w:ascii="Arial" w:hAnsi="Arial"/>
-                <w:color w:val="000000"/>
-                <w:sz w:val="16"/>
-              </w:rPr>
               <w:t>0.58/0.54</w:t>
             </w:r>
           </w:p>
@@ -2140,15 +1572,7 @@
             <w:tcW w:w="1080" w:type="dxa"/>
           </w:tcPr>
           <w:p>
-            <w:pPr>
-              <w:jc w:val="center"/>
-            </w:pPr>
             <w:r>
-              <w:rPr>
-                <w:rFonts w:ascii="Arial" w:hAnsi="Arial"/>
-                <w:color w:val="000000"/>
-                <w:sz w:val="16"/>
-              </w:rPr>
               <w:t>0.57/0.54</w:t>
             </w:r>
           </w:p>
@@ -2158,15 +1582,7 @@
             <w:tcW w:w="1080" w:type="dxa"/>
           </w:tcPr>
           <w:p>
-            <w:pPr>
-              <w:jc w:val="center"/>
-            </w:pPr>
             <w:r>
-              <w:rPr>
-                <w:rFonts w:ascii="Arial" w:hAnsi="Arial"/>
-                <w:color w:val="000000"/>
-                <w:sz w:val="16"/>
-              </w:rPr>
               <w:t>0.54/0.46</w:t>
             </w:r>
           </w:p>
@@ -2176,15 +1592,7 @@
             <w:tcW w:w="1080" w:type="dxa"/>
           </w:tcPr>
           <w:p>
-            <w:pPr>
-              <w:jc w:val="center"/>
-            </w:pPr>
             <w:r>
-              <w:rPr>
-                <w:rFonts w:ascii="Arial" w:hAnsi="Arial"/>
-                <w:color w:val="000000"/>
-                <w:sz w:val="16"/>
-              </w:rPr>
               <w:t>0.56/0.54</w:t>
             </w:r>
           </w:p>
@@ -2194,15 +1602,7 @@
             <w:tcW w:w="1080" w:type="dxa"/>
           </w:tcPr>
           <w:p>
-            <w:pPr>
-              <w:jc w:val="center"/>
-            </w:pPr>
             <w:r>
-              <w:rPr>
-                <w:rFonts w:ascii="Arial" w:hAnsi="Arial"/>
-                <w:color w:val="000000"/>
-                <w:sz w:val="16"/>
-              </w:rPr>
               <w:t>0.55/0.50</w:t>
             </w:r>
           </w:p>

</xml_diff>

<commit_message>
Update analysis notebooks, findings reports, and output artifacts for Datasets 1 & 2
</commit_message>
<xml_diff>
--- a/Findings/Ablation_Study_Conclusions.docx
+++ b/Findings/Ablation_Study_Conclusions.docx
@@ -8,22 +8,9 @@
         <w:jc w:val="center"/>
       </w:pPr>
       <w:r>
-        <w:rPr>
-          <w:rFonts w:ascii="Arial" w:hAnsi="Arial"/>
-          <w:b/>
-          <w:color w:val="000000"/>
-          <w:sz w:val="30"/>
-        </w:rPr>
-        <w:t>EXECUTIVE SUMMARY: EEG MIND-WANDERING ABLATION ANALYSIS</w:t>
-      </w:r>
-      <w:r>
-        <w:rPr>
-          <w:rFonts w:ascii="Arial" w:hAnsi="Arial"/>
-          <w:b/>
-          <w:color w:val="000000"/>
-          <w:sz w:val="30"/>
-        </w:rPr>
+        <w:t>–E–X–E–C–U–T–I–V–E– –S–U–M–M–A–R–Y–:– –E–E–G– –M–I–N–D–-–W–A–N–D–E–R–I–N–G– –A–B–L–A–T–I–O–N– –A–N–A–L–Y–S–I–S–</w:t>
         <w:br/>
+        <w:t>–</w:t>
       </w:r>
     </w:p>
     <w:p>
@@ -32,11 +19,7 @@
         <w:spacing w:before="160" w:after="80"/>
       </w:pPr>
       <w:r>
-        <w:rPr>
-          <w:rFonts w:ascii="Arial" w:hAnsi="Arial"/>
-          <w:color w:val="000000"/>
-        </w:rPr>
-        <w:t>1. Key Conclusions and Interpretations</w:t>
+        <w:t>–1–.– –K–e–y– –C–o–n–c–l–u–s–i–o–n–s– –a–n–d– –I–n–t–e–r–p–r–e–t–a–t–i–o–n–s–</w:t>
       </w:r>
     </w:p>
     <w:p>
@@ -45,12 +28,7 @@
         <w:spacing w:before="120" w:after="60"/>
       </w:pPr>
       <w:r>
-        <w:rPr>
-          <w:rFonts w:ascii="Arial" w:hAnsi="Arial"/>
-          <w:color w:val="000000"/>
-          <w:sz w:val="24"/>
-        </w:rPr>
-        <w:t>1.1 Preprocessing Impact (Raw vs. ICA-cleaned)</w:t>
+        <w:t>–1–.–1– –P–r–e–p–r–o–c–e–s–s–i–n–g– –I–m–p–a–c–t– –(–R–a–w– –v–s–.– –I–C–A–-–c–l–e–a–n–e–d–)–</w:t>
       </w:r>
     </w:p>
     <w:p>
@@ -59,7 +37,7 @@
         <w:spacing w:after="60"/>
       </w:pPr>
       <w:r>
-        <w:t>Dataset 1: In Dataset 1 (19 channels), ICA cleaning has negligible impact on classification accuracy (SVM Baseline Raw: 0.609 vs. Cleaned: 0.618).</w:t>
+        <w:t>–D–a–t–a–s–e–t– –1–:– –I–n– –D–a–t–a–s–e–t– –1– –(–1–9– –c–h–a–n–n–e–l–s–)–,– –I–C–A– –c–l–e–a–n–i–n–g– –h–a–s– –n–e–g–l–i–g–i–b–l–e– –i–m–p–a–c–t– –o–n– –c–l–a–s–s–i–f–i–c–a–t–i–o–n– –p–e–r–f–o–r–m–a–n–c–e– –(–S–V–M– –B–a–s–e–l–i–n–e– –R–a–w–:– –0–.–6–1–5– –a–c–c–u–r–a–c–y– –/– –0–.–5–5–7– –F–1– –v–s–.– –C–l–e–a–n–e–d–:– –0–.–6–1–9– –a–c–c–u–r–a–c–y– –/– –0–.–5–5–1– –F–1–;– –L–o–g–i–s–t–i–c– –R–e–g–r–e–s–s–i–o–n– –B–a–s–e–l–i–n–e– –R–a–w–:– –0–.–5–7–1– –a–c–c–u–r–a–c–y– –/– –0–.–5–0–4– –F–1– –v–s–.– –C–l–e–a–n–e–d–:– –0–.–5–6–7– –a–c–c–u–r–a–c–y– –/– –0–.–4–8–4– –F–1–)–.–</w:t>
       </w:r>
     </w:p>
     <w:p>
@@ -68,7 +46,7 @@
         <w:spacing w:after="60"/>
       </w:pPr>
       <w:r>
-        <w:t>Dataset 2: In Dataset 2 (64 channels), ICA cleaning degrades SVM baseline accuracy from 0.75 to 0.68, while Logistic Regression accuracy increases from 0.75 to 0.76.</w:t>
+        <w:t>–D–a–t–a–s–e–t– –2–:– –I–n– –D–a–t–a–s–e–t– –2– –(–6–4– –c–h–a–n–n–e–l–s–)–,– –a–c–r–o–s–s– –t–h–e– –2–,–2–4–0–-–f–e–a–t–u–r–e– –a–b–l–a–t–i–o–n– –b–a–s–e–l–i–n–e– –e–v–a–l–u–a–t–e–d– –u–n–d–e–r– –5–-–f–o–l–d– –c–r–o–s–s–-–v–a–l–i–d–a–t–i–o–n–,– –I–C–A– –c–l–e–a–n–i–n–g– –s–h–o–w–s– –m–i–l–d– –a–t–t–e–n–u–a–t–i–o–n– –f–o–r– –b–o–t–h– –m–o–d–e–l–s– –(–S–V–M– –B–a–s–e–l–i–n–e– –R–a–w–:– –0–.–6–8–4– –a–c–c–u–r–a–c–y– –/– –0–.–5–9–4– –F–1– –v–s–.– –C–l–e–a–n–e–d–:– –0–.–6–5–5– –a–c–c–u–r–a–c–y– –/– –0–.–5–8–4– –F–1–;– –L–o–g–i–s–t–i–c– –R–e–g–r–e–s–s–i–o–n– –B–a–s–e–l–i–n–e– –R–a–w–:– –0–.–7–6–6– –a–c–c–u–r–a–c–y– –/– –0–.–6–9–9– –F–1– –v–s–.– –C–l–e–a–n–e–d–:– –0–.–7–3–8– –a–c–c–u–r–a–c–y– –/– –0–.–6–4–0– –F–1–)–.– –N–o–t–a–b–l–y–,– –i–n– –t–h–e– –d–e–d–i–c–a–t–e–d– –p–o–o–l–e–d– –c–l–a–s–s–i–f–i–c–a–t–i–o–n– –a–n–a–l–y–s–i–s–,– –R–a–w– –a–n–d– –I–C–A–-–c–l–e–a–n–e–d– –E–E–G– –a–c–h–i–e–v–e– –i–d–e–n–t–i–c–a–l– –S–V–M– –p–e–r–f–o–r–m–a–n–c–e– –(–0–.–8–4–9–1– –R–a–w– –v–s–.– –0–.–8–4–9–1– –C–l–e–a–n–e–d–)– –a–n–d– –c–o–m–p–a–r–a–b–l–e– –L–o–g–i–s–t–i–c– –R–e–g–r–e–s–s–i–o–n– –p–e–r–f–o–r–m–a–n–c–e– –(–0–.–8–8–0–6– –R–a–w– –v–s–.– –0–.–8–6–0–6– –C–l–e–a–n–e–d–)–.–</w:t>
       </w:r>
     </w:p>
     <w:p>
@@ -77,21 +55,7 @@
         <w:spacing w:after="60"/>
       </w:pPr>
       <w:r>
-        <w:rPr>
-          <w:rFonts w:ascii="Arial" w:hAnsi="Arial"/>
-          <w:b/>
-          <w:color w:val="000000"/>
-          <w:sz w:val="20"/>
-        </w:rPr>
-        <w:t xml:space="preserve">Interpretation: </w:t>
-      </w:r>
-      <w:r>
-        <w:rPr>
-          <w:rFonts w:ascii="Arial" w:hAnsi="Arial"/>
-          <w:color w:val="000000"/>
-          <w:sz w:val="20"/>
-        </w:rPr>
-        <w:t>This indicates that while SVM shows a performance drop after ICA cleaning (likely due to the removal of muscle/ocular artifacts that correlate with task states), Logistic Regression is robust to these changes, suggesting that the model resolves distinct neural sources of focus and mind-wandering when trained on the full dataset.</w:t>
+        <w:t>–I–n–t–e–r–p–r–e–t–a–t–i–o–n–:– –U–n–d–e–r– –u–n–i–f–o–r–m– –f–i–l–t–e–r–i–n–g– –(–0–.–5–––4–5– –H–z–)– –a–n–d– –u–n–i–f–o–r–m– –2–5–6– –H–z– –s–a–m–p–l–i–n–g–,– –t–h–e– –p–r–e–v–i–o–u–s–l–y– –r–e–p–o–r–t–e–d– –s–e–v–e–r–e– –d–e–g–r–a–d–a–t–i–o–n– –o–f– –S–V–M– –u–n–d–e–r– –I–C–A– –c–l–e–a–n–i–n–g– –i–s– –n–o– –l–o–n–g–e–r– –o–b–s–e–r–v–e–d– –i–n– –p–o–o–l–e–d– –d–a–t–a–,– –i–n–d–i–c–a–t–i–n–g– –t–h–a–t– –n–e–u–r–a–l– –r–e–p–r–e–s–e–n–t–a–t–i–o–n–s– –o–f– –m–i–n–d–-–w–a–n–d–e–r–i–n–g– –a–r–e– –p–r–e–s–e–r–v–e–d– –a–c–r–o–s–s– –b–o–t–h– –r–a–w– –a–n–d– –a–r–t–i–f–a–c–t–-–c–l–e–a–n–e–d– –s–i–g–n–a–l–s–.– –I–n– –c–r–o–s–s–-–v–a–l–i–d–a–t–e–d– –f–e–a–t–u–r–e– –a–b–l–a–t–i–o–n–,– –l–i–n–e–a–r– –m–o–d–e–l–s– –(–L–o–g–i–s–t–i–c– –R–e–g–r–e–s–s–i–o–n– –a–t– –0–.–7–7– –R–a–w–)– –c–o–n–s–i–s–t–e–n–t–l–y– –o–u–t–p–e–r–f–o–r–m– –S–V–M– –(–0–.–6–8– –R–a–w–)– –a–c–r–o–s–s– –t–h–e– –f–u–l–l– –f–e–a–t–u–r–e– –m–o–n–t–a–g–e–.–</w:t>
       </w:r>
     </w:p>
     <w:p>
@@ -100,12 +64,7 @@
         <w:spacing w:before="120" w:after="60"/>
       </w:pPr>
       <w:r>
-        <w:rPr>
-          <w:rFonts w:ascii="Arial" w:hAnsi="Arial"/>
-          <w:color w:val="000000"/>
-          <w:sz w:val="24"/>
-        </w:rPr>
-        <w:t>1.2 Feature Family Overload and Noise</w:t>
+        <w:t>–1–.–2– –F–e–a–t–u–r–e– –F–a–m–i–l–y– –O–v–e–r–l–o–a–d– –a–n–d– –N–o–i–s–e–</w:t>
       </w:r>
     </w:p>
     <w:p>
@@ -114,37 +73,7 @@
         <w:spacing w:after="60"/>
       </w:pPr>
       <w:r>
-        <w:rPr>
-          <w:rFonts w:ascii="Arial" w:hAnsi="Arial"/>
-          <w:b/>
-          <w:color w:val="000000"/>
-          <w:sz w:val="20"/>
-        </w:rPr>
-        <w:t xml:space="preserve">Dataset 1: </w:t>
-      </w:r>
-      <w:r>
-        <w:rPr>
-          <w:rFonts w:ascii="Arial" w:hAnsi="Arial"/>
-          <w:color w:val="000000"/>
-          <w:sz w:val="20"/>
-        </w:rPr>
-        <w:t>Dataset 1 exhibits high redundancy</w:t>
-      </w:r>
-      <w:r>
-        <w:rPr>
-          <w:rFonts w:ascii="Arial" w:hAnsi="Arial"/>
-          <w:color w:val="000000"/>
-          <w:sz w:val="20"/>
-        </w:rPr>
-        <w:t>,</w:t>
-      </w:r>
-      <w:r>
-        <w:rPr>
-          <w:rFonts w:ascii="Arial" w:hAnsi="Arial"/>
-          <w:color w:val="000000"/>
-          <w:sz w:val="20"/>
-        </w:rPr>
-        <w:t xml:space="preserve"> omitting any single family does not reduce performance. Isolating Hjorth features (0.61 accuracy) yields the best single-family model.</w:t>
+        <w:t>–D–a–t–a–s–e–t– –1–:– –D–a–t–a–s–e–t– –1– –e–x–h–i–b–i–t–s– –h–i–g–h– –r–e–d–u–n–d–a–n–c–y–;– –o–m–i–t–t–i–n–g– –a–n–y– –s–i–n–g–l–e– –f–a–m–i–l–y– –m–a–i–n–t–a–i–n–s– –b–a–s–e–l–i–n–e– –p–e–r–f–o–r–m–a–n–c–e– –(–~–0–.–5–9–––0–.–6–2– –f–o–r– –S–V–M–,– –~–0–.–5–6–––0–.–6–0– –f–o–r– –L–R–)–.– –I–s–o–l–a–t–i–n–g– –H–j–o–r–t–h– –f–e–a–t–u–r–e–s– –(–0–.–5–9– –a–c–c–u–r–a–c–y– –/– –0–.–5–5– –F–1–)– –a–n–d– –i–s–o–l–a–t–i–n–g– –S–p–e–c–t–r–a–l– –f–e–a–t–u–r–e–s– –(–0–.–5–9– –a–c–c–u–r–a–c–y– –/– –0–.–5–2– –F–1–)– –b–o–t–h– –y–i–e–l–d– –s–t–r–o–n–g– –s–i–n–g–l–e–-–f–a–m–i–l–y– –r–e–p–r–e–s–e–n–t–a–t–i–o–n–s–.–</w:t>
       </w:r>
     </w:p>
     <w:p>
@@ -153,7 +82,7 @@
         <w:spacing w:after="60"/>
       </w:pPr>
       <w:r>
-        <w:t>Dataset 2: Isolating Spectral features (Only Spectral) drops SVM Raw accuracy from 0.75 to 0.71, and degrades Logistic Regression Raw accuracy from 0.75 to 0.65.</w:t>
+        <w:t>–D–a–t–a–s–e–t– –2–:– –I–s–o–l–a–t–i–n–g– –S–p–e–c–t–r–a–l– –f–e–a–t–u–r–e–s– –(–O–n–l–y– –S–p–e–c–t–r–a–l–)– –d–r–o–p–s– –S–V–M– –R–a–w– –a–c–c–u–r–a–c–y– –f–r–o–m– –0–.–6–8– –t–o– –0–.–6–6– –(–F–1– –0–.–5–8–)– –a–n–d– –d–e–g–r–a–d–e–s– –L–o–g–i–s–t–i–c– –R–e–g–r–e–s–s–i–o–n– –R–a–w– –a–c–c–u–r–a–c–y– –f–r–o–m– –0–.–7–7– –t–o– –0–.–6–9– –(–F–1– –0–.–6–2–)–.– –O–m–i–t–t–i–n–g– –s–p–e–c–t–r–a–l– –f–e–a–t–u–r–e–s– –r–e–d–u–c–e–s– –S–V–M– –t–o– –0–.–6–1– –(–F–1– –0–.–5–3–)– –a–n–d– –L–R– –t–o– –0–.–7–5– –(–F–1– –0–.–6–8–)–.–</w:t>
       </w:r>
     </w:p>
     <w:p>
@@ -162,21 +91,7 @@
         <w:spacing w:after="60"/>
       </w:pPr>
       <w:r>
-        <w:rPr>
-          <w:rFonts w:ascii="Arial" w:hAnsi="Arial"/>
-          <w:b/>
-          <w:color w:val="000000"/>
-          <w:sz w:val="20"/>
-        </w:rPr>
-        <w:t xml:space="preserve">Interpretation: </w:t>
-      </w:r>
-      <w:r>
-        <w:rPr>
-          <w:rFonts w:ascii="Arial" w:hAnsi="Arial"/>
-          <w:color w:val="000000"/>
-          <w:sz w:val="20"/>
-        </w:rPr>
-        <w:t>In denser channel montages with the full dataset, the baseline models are better able to utilize multi-domain features, and restricting the features to the spectral domain degrades the Logistic Regression model, though it still provides a small benefit to the SVM model.</w:t>
+        <w:t>–I–n–t–e–r–p–r–e–t–a–t–i–o–n–:– –I–n– –d–e–n–s–e–r– –c–h–a–n–n–e–l– –m–o–n–t–a–g–e–s–,– –m–u–l–t–i–-–d–o–m–a–i–n– –f–e–a–t–u–r–e– –i–n–t–e–g–r–a–t–i–o–n– –(–c–o–m–b–i–n–i–n–g– –s–p–e–c–t–r–a–l– –p–o–w–e–r–,– –o–s–c–i–l–l–a–t–o–r–y– –e–n–v–e–l–o–p–e–s–,– –a–n–d– –H–j–o–r–t–h– –p–a–r–a–m–e–t–e–r–s–)– –i–s– –e–s–s–e–n–t–i–a–l– –f–o–r– –o–p–t–i–m–a–l– –c–l–a–s–s–i–f–i–c–a–t–i–o–n–,– –w–i–t–h– –L–o–g–i–s–t–i–c– –R–e–g–r–e–s–s–i–o–n– –s–u–f–f–e–r–i–n–g– –a–n– –8–-–p–e–r–c–e–n–t–a–g–e–-–p–o–i–n–t– –d–e–g–r–a–d–a–t–i–o–n– –w–h–e–n– –r–e–s–t–r–i–c–t–e–d– –t–o– –s–p–e–c–t–r–a–l– –f–e–a–t–u–r–e–s– –a–l–o–n–e–.–</w:t>
       </w:r>
     </w:p>
     <w:p>
@@ -185,12 +100,7 @@
         <w:spacing w:before="120" w:after="60"/>
       </w:pPr>
       <w:r>
-        <w:rPr>
-          <w:rFonts w:ascii="Arial" w:hAnsi="Arial"/>
-          <w:color w:val="000000"/>
-          <w:sz w:val="24"/>
-        </w:rPr>
-        <w:t>1.3 Spatial Scalp Regions</w:t>
+        <w:t>–1–.–3– –S–p–a–t–i–a–l– –S–c–a–l–p– –R–e–g–i–o–n–s–</w:t>
       </w:r>
     </w:p>
     <w:p>
@@ -199,21 +109,7 @@
         <w:spacing w:after="60"/>
       </w:pPr>
       <w:r>
-        <w:rPr>
-          <w:rFonts w:ascii="Arial" w:hAnsi="Arial"/>
-          <w:b/>
-          <w:color w:val="000000"/>
-          <w:sz w:val="20"/>
-        </w:rPr>
-        <w:t xml:space="preserve">Dataset 1: </w:t>
-      </w:r>
-      <w:r>
-        <w:rPr>
-          <w:rFonts w:ascii="Arial" w:hAnsi="Arial"/>
-          <w:color w:val="000000"/>
-          <w:sz w:val="20"/>
-        </w:rPr>
-        <w:t>Isolating Central &amp; Temporal electrodes (Only Central &amp; Temporal) preserves baseline accuracy (0.61) in Dataset 1, while Frontal or Posterior configurations reduce performance.</w:t>
+        <w:t>–D–a–t–a–s–e–t– –1–:– –I–s–o–l–a–t–i–n–g– –C–e–n–t–r–a–l– –&amp;– –T–e–m–p–o–r–a–l– –e–l–e–c–t–r–o–d–e–s– –(–O–n–l–y– –C–e–n–t–r–a–l– –&amp;– –T–e–m–p–o–r–a–l–)– –a–c–h–i–e–v–e–s– –t–h–e– –h–i–g–h–e–s–t– –r–e–g–i–o–n–a–l– –p–e–r–f–o–r–m–a–n–c–e– –(–S–V–M– –R–a–w–:– –0–.–6–3– –a–c–c–u–r–a–c–y– –/– –0–.–5–7– –F–1–,– –L–R– –R–a–w–:– –0–.–6–1– –a–c–c–u–r–a–c–y– –/– –0–.–5–8– –F–1–)–,– –e–x–c–e–e–d–i–n–g– –f–u–l–l–-–m–o–n–t–a–g–e– –b–a–s–e–l–i–n–e– –a–c–c–u–r–a–c–y– –(–0–.–6–1– –/– –0–.–5–7–)–,– –w–h–e–r–e–a–s– –A–n–t–e–r–i–o–r– –(–0–.–5–9– –/– –0–.–5–5–)– –a–n–d– –P–o–s–t–e–r–i–o–r– –(–0–.–6–1– –/– –0–.–5–3–)– –c–o–n–f–i–g–u–r–a–t–i–o–n–s– –s–h–o–w– –l–o–w–e–r– –c–l–a–s–s–i–f–i–c–a–t–i–o–n– –p–o–w–e–r–.–</w:t>
       </w:r>
     </w:p>
     <w:p>
@@ -222,7 +118,7 @@
         <w:spacing w:after="60"/>
       </w:pPr>
       <w:r>
-        <w:t>Dataset 2: Under SVM Raw, Anterior (Frontal) (0.76 accuracy) and Central &amp; Temporal (0.75 accuracy) electrodes show the highest standalone classification power, while Posterior electrodes alone are weaker (0.71 accuracy).</w:t>
+        <w:t>–D–a–t–a–s–e–t– –2–:– –U–n–d–e–r– –S–V–M– –R–a–w–,– –P–o–s–t–e–r–i–o–r– –e–l–e–c–t–r–o–d–e–s– –(–O–n–l–y– –P–o–s–t–e–r–i–o–r–)– –d–e–m–o–n–s–t–r–a–t–e– –t–h–e– –h–i–g–h–e–s–t– –s–t–a–n–d–a–l–o–n–e– –c–l–a–s–s–i–f–i–c–a–t–i–o–n– –p–e–r–f–o–r–m–a–n–c–e– –(–0–.–7–4– –a–c–c–u–r–a–c–y– –/– –0–.–7–1– –F–1–)–,– –s–u–r–p–a–s–s–i–n–g– –t–h–e– –f–u–l–l– –6–4–-–c–h–a–n–n–e–l– –b–a–s–e–l–i–n–e– –(–0–.–6–8–)– –a–s– –w–e–l–l– –a–s– –A–n–t–e–r–i–o–r– –(–0–.–6–3– –a–c–c–u–r–a–c–y– –/– –0–.–5–5– –F–1–)– –a–n–d– –C–e–n–t–r–a–l– –&amp;– –T–e–m–p–o–r–a–l– –(–0–.–6–6– –a–c–c–u–r–a–c–y– –/– –0–.–5–2– –F–1–)– –s–u–b–s–e–t–s–.– –F–o–r– –L–o–g–i–s–t–i–c– –R–e–g–r–e–s–s–i–o–n–,– –C–e–n–t–r–a–l– –&amp;– –T–e–m–p–o–r–a–l– –e–l–e–c–t–r–o–d–e–s– –p–r–o–v–i–d–e– –t–h–e– –h–i–g–h–e–s–t– –s–t–a–n–d–a–l–o–n–e– –a–c–c–u–r–a–c–y– –(–0–.–7–4– –a–c–c–u–r–a–c–y– –/– –0–.–6–7– –F–1–)–,– –c–l–o–s–e–l–y– –f–o–l–l–o–w–e–d– –b–y– –P–o–s–t–e–r–i–o–r– –(–0–.–6–7– –a–c–c–u–r–a–c–y– –/– –0–.–5–2– –F–1–)– –a–n–d– –A–n–t–e–r–i–o–r– –(–0–.–6–6– –a–c–c–u–r–a–c–y– –/– –0–.–6–2– –F–1–)–.–</w:t>
       </w:r>
     </w:p>
     <w:p>
@@ -231,21 +127,7 @@
         <w:spacing w:after="60"/>
       </w:pPr>
       <w:r>
-        <w:rPr>
-          <w:rFonts w:ascii="Arial" w:hAnsi="Arial"/>
-          <w:b/>
-          <w:color w:val="000000"/>
-          <w:sz w:val="20"/>
-        </w:rPr>
-        <w:t xml:space="preserve">Interpretation: </w:t>
-      </w:r>
-      <w:r>
-        <w:rPr>
-          <w:rFonts w:ascii="Arial" w:hAnsi="Arial"/>
-          <w:color w:val="000000"/>
-          <w:sz w:val="20"/>
-        </w:rPr>
-        <w:t>Central/temporal and posterior sensor regions are the primary spatial carries of neural signals indicating mind-wandering, while frontal electrodes alone are less predictive.</w:t>
+        <w:t>–I–n–t–e–r–p–r–e–t–a–t–i–o–n–:– –I–n– –D–a–t–a–s–e–t– –2–,– –p–o–s–t–e–r–i–o–r–/–o–c–c–i–p–i–t–a–l– –s–e–n–s–o–r–s– –e–m–e–r–g–e– –a–s– –a– –p–r–i–m–a–r–y– –s–p–a–t–i–a–l– –c–a–r–r–i–e–r– –o–f– –m–i–n–d–-–w–a–n–d–e–r–i–n–g– –s–i–g–n–a–l–s– –f–o–r– –n–o–n–-–l–i–n–e–a–r– –S–V–M– –c–l–a–s–s–i–f–i–c–a–t–i–o–n–,– –r–e–f–l–e–c–t–i–n–g– –p–r–o–f–o–u–n–d– –s–e–n–s–o–r–y– –v–i–s–u–a–l– –g–a–t–i–n–g–,– –w–h–i–l–e– –c–e–n–t–r–a–l– –a–n–d– –t–e–m–p–o–r–a–l– –s–e–n–s–o–r–s– –p–r–o–v–i–d–e– –r–o–b–u–s–t– –l–i–n–e–a–r– –d–i–s–c–r–i–m–i–n–a–n–t– –i–n–f–o–r–m–a–t–i–o–n– –f–o–r– –t–a–s–k–-–m–o–n–i–t–o–r–i–n–g– –d–y–n–a–m–i–c–s–.–</w:t>
       </w:r>
     </w:p>
     <w:p>
@@ -254,12 +136,7 @@
         <w:spacing w:before="120" w:after="60"/>
       </w:pPr>
       <w:r>
-        <w:rPr>
-          <w:rFonts w:ascii="Arial" w:hAnsi="Arial"/>
-          <w:color w:val="000000"/>
-          <w:sz w:val="24"/>
-        </w:rPr>
-        <w:t>1.4 Dominant Frequency Bands</w:t>
+        <w:t>–1–.–4– –D–o–m–i–n–a–n–t– –F–r–e–q–u–e–n–c–y– –B–a–n–d–s–</w:t>
       </w:r>
     </w:p>
     <w:p>
@@ -268,21 +145,7 @@
         <w:spacing w:after="60"/>
       </w:pPr>
       <w:r>
-        <w:rPr>
-          <w:rFonts w:ascii="Arial" w:hAnsi="Arial"/>
-          <w:b/>
-          <w:color w:val="000000"/>
-          <w:sz w:val="20"/>
-        </w:rPr>
-        <w:t xml:space="preserve">Dataset 1: </w:t>
-      </w:r>
-      <w:r>
-        <w:rPr>
-          <w:rFonts w:ascii="Arial" w:hAnsi="Arial"/>
-          <w:color w:val="000000"/>
-          <w:sz w:val="20"/>
-        </w:rPr>
-        <w:t>Isolating Theta (Only Theta) preserves baseline accuracy (0.60 vs. 0.59 baseline), identifying Theta as the main driver of spectral classification in Dataset 1.</w:t>
+        <w:t>–D–a–t–a–s–e–t– –1–:– –I–s–o–l–a–t–i–n–g– –T–h–e–t–a– –(–O–n–l–y– –T–h–e–t–a–)– –p–r–e–s–e–r–v–e–s– –b–a–s–e–l–i–n–e– –p–e–r–f–o–r–m–a–n–c–e– –(–S–V–M– –R–a–w–:– –0–.–6–0– –a–c–c–u–r–a–c–y– –/– –0–.–5–1– –F–1– –v–s–.– –0–.–5–9– –/– –0–.–5–2– –b–a–n–d– –b–a–s–e–l–i–n–e–)–,– –i–d–e–n–t–i–f–y–i–n–g– –T–h–e–t–a– –a–s– –t–h–e– –p–r–i–m–a–r–y– –s–i–n–g–l–e–-–b–a–n–d– –d–r–i–v–e–r– –o–f– –c–l–a–s–s–i–f–i–c–a–t–i–o–n– –i–n– –D–a–t–a–s–e–t– –1–.–</w:t>
       </w:r>
     </w:p>
     <w:p>
@@ -291,21 +154,7 @@
         <w:spacing w:after="60"/>
       </w:pPr>
       <w:r>
-        <w:rPr>
-          <w:rFonts w:ascii="Arial" w:hAnsi="Arial"/>
-          <w:b/>
-          <w:color w:val="000000"/>
-          <w:sz w:val="20"/>
-        </w:rPr>
-        <w:t xml:space="preserve">Dataset 2: </w:t>
-      </w:r>
-      <w:r>
-        <w:rPr>
-          <w:rFonts w:ascii="Arial" w:hAnsi="Arial"/>
-          <w:color w:val="000000"/>
-          <w:sz w:val="20"/>
-        </w:rPr>
-        <w:t>Alpha band power remains the key performance driver in the frequency bands. Omitting Alpha (Omit Alpha) drops SVM Raw accuracy from 0.65 to 0.59, whereas isolating Alpha (Only Alpha) recovers almost the entire bandwise baseline performance (0.64 accuracy vs. 0.65 baseline).</w:t>
+        <w:t>–D–a–t–a–s–e–t– –2–:– –A–l–p–h–a– –b–a–n–d– –p–o–w–e–r– –r–e–m–a–i–n–s– –t–h–e– –k–e–y– –p–e–r–f–o–r–m–a–n–c–e– –d–r–i–v–e–r– –a–m–o–n–g– –f–r–e–q–u–e–n–c–y– –b–a–n–d–s–.– –O–m–i–t–t–i–n–g– –A–l–p–h–a– –(–O–m–i–t– –A–l–p–h–a–)– –d–r–o–p–s– –S–V–M– –R–a–w– –a–c–c–u–r–a–c–y– –f–r–o–m– –0–.–6–5– –t–o– –0–.–6–0– –(–F–1– –f–r–o–m– –0–.–6–0– –t–o– –0–.–5–4–)–,– –w–h–e–r–e–a–s– –i–s–o–l–a–t–i–n–g– –A–l–p–h–a– –(–O–n–l–y– –A–l–p–h–a–)– –r–e–c–o–v–e–r–s– –0–.–6–2– –a–c–c–u–r–a–c–y– –/– –0–.–5–7– –F–1–,– –o–u–t–p–e–r–f–o–r–m–i–n–g– –a–l–l– –o–t–h–e–r– –i–s–o–l–a–t–e–d– –b–a–n–d–s– –(–D–e–l–t–a– –0–.–5–5–,– –T–h–e–t–a– –0–.–5–5–,– –B–e–t–a– –0–.–5–8–,– –G–a–m–m–a– –0–.–5–3–)–.–</w:t>
       </w:r>
     </w:p>
     <w:p>
@@ -314,21 +163,7 @@
         <w:spacing w:after="60"/>
       </w:pPr>
       <w:r>
-        <w:rPr>
-          <w:rFonts w:ascii="Arial" w:hAnsi="Arial"/>
-          <w:b/>
-          <w:color w:val="000000"/>
-          <w:sz w:val="20"/>
-        </w:rPr>
-        <w:t xml:space="preserve">Interpretation: </w:t>
-      </w:r>
-      <w:r>
-        <w:rPr>
-          <w:rFonts w:ascii="Arial" w:hAnsi="Arial"/>
-          <w:color w:val="000000"/>
-          <w:sz w:val="20"/>
-        </w:rPr>
-        <w:t>Elevated Alpha (gating of sensory inputs/cortical idling) and elevated Theta (internal cognitive processing) are the key physiological correlates of mind-wandering, with Alpha holding the most classification weight in Dataset 2.</w:t>
+        <w:t>–I–n–t–e–r–p–r–e–t–a–t–i–o–n–:– –E–l–e–v–a–t–e–d– –A–l–p–h–a– –(–r–e–f–l–e–c–t–i–n–g– –s–e–n–s–o–r–y– –g–a–t–i–n–g– –a–n–d– –c–o–r–t–i–c–a–l– –i–d–l–i–n–g–)– –a–n–d– –e–l–e–v–a–t–e–d– –T–h–e–t–a– –(–r–e–f–l–e–c–t–i–n–g– –i–n–t–e–r–n–a–l– –m–e–m–o–r–y– –r–e–t–r–i–e–v–a–l– –a–n–d– –m–i–n–d–-–w–a–n–d–e–r–i–n–g– –l–o–a–d–)– –r–e–p–r–e–s–e–n–t– –t–h–e– –t–w–o– –m–o–s–t– –d–e–c–i–s–i–v–e– –s–p–e–c–t–r–a–l– –b–i–o–m–a–r–k–e–r–s– –a–c–r–o–s–s– –b–o–t–h– –d–a–t–a–s–e–t–s–,– –w–i–t–h– –A–l–p–h–a– –e–x–e–r–t–i–n–g– –p–r–i–m–a–r–y– –d–i–s–c–r–i–m–i–n–a–t–i–v–e– –w–e–i–g–h–t– –i–n– –D–a–t–a–s–e–t– –2– –a–n–d– –T–h–e–t–a– –i–n– –D–a–t–a–s–e–t– –1–.–</w:t>
       </w:r>
     </w:p>
     <w:p>
@@ -337,11 +172,7 @@
         <w:spacing w:before="160" w:after="80"/>
       </w:pPr>
       <w:r>
-        <w:rPr>
-          <w:rFonts w:ascii="Arial" w:hAnsi="Arial"/>
-          <w:color w:val="000000"/>
-        </w:rPr>
-        <w:t>2. Selected Key Ablation Results Table</w:t>
+        <w:t>–2–.– –S–e–l–e–c–t–e–d– –K–e–y– –A–b–l–a–t–i–o–n– –R–e–s–u–l–t–s– –T–a–b–l–e–</w:t>
       </w:r>
     </w:p>
     <w:p>
@@ -349,12 +180,7 @@
         <w:spacing w:after="100"/>
       </w:pPr>
       <w:r>
-        <w:rPr>
-          <w:rFonts w:ascii="Arial" w:hAnsi="Arial"/>
-          <w:color w:val="000000"/>
-          <w:sz w:val="20"/>
-        </w:rPr>
-        <w:t>Values represent classification performance formatted as: Accuracy / F1-Score. This table includes only the critical baselines and the most relevant isolation/omission conditions that highlight the main findings.</w:t>
+        <w:t>–V–a–l–u–e–s– –r–e–p–r–e–s–e–n–t– –c–l–a–s–s–i–f–i–c–a–t–i–o–n– –p–e–r–f–o–r–m–a–n–c–e– –f–o–r–m–a–t–t–e–d– –a–s–:– –A–c–c–u–r–a–c–y– –/– –F–1–-–S–c–o–r–e–.– –T–h–i–s– –t–a–b–l–e– –i–n–c–l–u–d–e–s– –o–n–l–y– –t–h–e– –c–r–i–t–i–c–a–l– –b–a–s–e–l–i–n–e–s– –a–n–d– –t–h–e– –m–o–s–t– –r–e–l–e–v–a–n–t– –i–s–o–l–a–t–i–o–n–/–o–m–i–s–s–i–o–n– –c–o–n–d–i–t–i–o–n–s– –t–h–a–t– –h–i–g–h–l–i–g–h–t– –t–h–e– –m–a–i–n– –f–i–n–d–i–n–g–s–.–</w:t>
       </w:r>
     </w:p>
     <w:tbl>
@@ -697,12 +523,6 @@
           </w:tcPr>
           <w:p>
             <w:r>
-              <w:rPr>
-                <w:rFonts w:ascii="Arial" w:hAnsi="Arial"/>
-                <w:color w:val="000000"/>
-                <w:sz w:val="16"/>
-              </w:rPr>
-              <w:lastRenderedPageBreak/>
               <w:t>Baseline</w:t>
             </w:r>
           </w:p>
@@ -713,11 +533,6 @@
           </w:tcPr>
           <w:p>
             <w:r>
-              <w:rPr>
-                <w:rFonts w:ascii="Arial" w:hAnsi="Arial"/>
-                <w:color w:val="000000"/>
-                <w:sz w:val="16"/>
-              </w:rPr>
               <w:t>Full Feature Set</w:t>
             </w:r>
           </w:p>
@@ -728,7 +543,7 @@
           </w:tcPr>
           <w:p>
             <w:r>
-              <w:t>0.61/0.54</w:t>
+              <w:t>0.61/0.56</w:t>
             </w:r>
           </w:p>
         </w:tc>
@@ -748,7 +563,617 @@
           </w:tcPr>
           <w:p>
             <w:r>
-              <w:t>0.57/0.51</w:t>
+              <w:t>0.57/0.50</w:t>
+            </w:r>
+          </w:p>
+        </w:tc>
+        <w:tc>
+          <w:tcPr>
+            <w:tcW w:w="1080" w:type="dxa"/>
+          </w:tcPr>
+          <w:p>
+            <w:r>
+              <w:t>0.57/0.48</w:t>
+            </w:r>
+          </w:p>
+        </w:tc>
+        <w:tc>
+          <w:tcPr>
+            <w:tcW w:w="1080" w:type="dxa"/>
+          </w:tcPr>
+          <w:p>
+            <w:r>
+              <w:t>0.68/0.59</w:t>
+            </w:r>
+          </w:p>
+        </w:tc>
+        <w:tc>
+          <w:tcPr>
+            <w:tcW w:w="1080" w:type="dxa"/>
+          </w:tcPr>
+          <w:p>
+            <w:r>
+              <w:t>0.66/0.58</w:t>
+            </w:r>
+          </w:p>
+        </w:tc>
+        <w:tc>
+          <w:tcPr>
+            <w:tcW w:w="1080" w:type="dxa"/>
+          </w:tcPr>
+          <w:p>
+            <w:r>
+              <w:t>0.77/0.70</w:t>
+            </w:r>
+          </w:p>
+        </w:tc>
+        <w:tc>
+          <w:tcPr>
+            <w:tcW w:w="1080" w:type="dxa"/>
+          </w:tcPr>
+          <w:p>
+            <w:r>
+              <w:t>0.74/0.64</w:t>
+            </w:r>
+          </w:p>
+        </w:tc>
+      </w:tr>
+      <w:tr>
+        <w:trPr>
+          <w:jc w:val="center"/>
+        </w:trPr>
+        <w:tc>
+          <w:tcPr>
+            <w:tcW w:w="1584" w:type="dxa"/>
+          </w:tcPr>
+          <w:p>
+            <w:r>
+              <w:t>Feature Family (Isolate)</w:t>
+            </w:r>
+          </w:p>
+        </w:tc>
+        <w:tc>
+          <w:tcPr>
+            <w:tcW w:w="1728" w:type="dxa"/>
+          </w:tcPr>
+          <w:p>
+            <w:r>
+              <w:t>Only Spectral</w:t>
+            </w:r>
+          </w:p>
+        </w:tc>
+        <w:tc>
+          <w:tcPr>
+            <w:tcW w:w="1080" w:type="dxa"/>
+          </w:tcPr>
+          <w:p>
+            <w:r>
+              <w:t>0.59/0.52</w:t>
+            </w:r>
+          </w:p>
+        </w:tc>
+        <w:tc>
+          <w:tcPr>
+            <w:tcW w:w="1080" w:type="dxa"/>
+          </w:tcPr>
+          <w:p>
+            <w:r>
+              <w:t>0.60/0.53</w:t>
+            </w:r>
+          </w:p>
+        </w:tc>
+        <w:tc>
+          <w:tcPr>
+            <w:tcW w:w="1080" w:type="dxa"/>
+          </w:tcPr>
+          <w:p>
+            <w:r>
+              <w:t>0.58/0.52</w:t>
+            </w:r>
+          </w:p>
+        </w:tc>
+        <w:tc>
+          <w:tcPr>
+            <w:tcW w:w="1080" w:type="dxa"/>
+          </w:tcPr>
+          <w:p>
+            <w:r>
+              <w:t>0.61/0.56</w:t>
+            </w:r>
+          </w:p>
+        </w:tc>
+        <w:tc>
+          <w:tcPr>
+            <w:tcW w:w="1080" w:type="dxa"/>
+          </w:tcPr>
+          <w:p>
+            <w:r>
+              <w:t>0.66/0.58</w:t>
+            </w:r>
+          </w:p>
+        </w:tc>
+        <w:tc>
+          <w:tcPr>
+            <w:tcW w:w="1080" w:type="dxa"/>
+          </w:tcPr>
+          <w:p>
+            <w:r>
+              <w:t>0.64/0.55</w:t>
+            </w:r>
+          </w:p>
+        </w:tc>
+        <w:tc>
+          <w:tcPr>
+            <w:tcW w:w="1080" w:type="dxa"/>
+          </w:tcPr>
+          <w:p>
+            <w:r>
+              <w:t>0.69/0.62</w:t>
+            </w:r>
+          </w:p>
+        </w:tc>
+        <w:tc>
+          <w:tcPr>
+            <w:tcW w:w="1080" w:type="dxa"/>
+          </w:tcPr>
+          <w:p>
+            <w:r>
+              <w:t>0.67/0.50</w:t>
+            </w:r>
+          </w:p>
+        </w:tc>
+      </w:tr>
+      <w:tr>
+        <w:trPr>
+          <w:jc w:val="center"/>
+        </w:trPr>
+        <w:tc>
+          <w:tcPr>
+            <w:tcW w:w="1584" w:type="dxa"/>
+          </w:tcPr>
+          <w:p>
+            <w:r>
+              <w:t>Scalp Region (Isolate)</w:t>
+            </w:r>
+          </w:p>
+        </w:tc>
+        <w:tc>
+          <w:tcPr>
+            <w:tcW w:w="1728" w:type="dxa"/>
+          </w:tcPr>
+          <w:p>
+            <w:r>
+              <w:t>Only Central &amp; Temporal</w:t>
+            </w:r>
+          </w:p>
+        </w:tc>
+        <w:tc>
+          <w:tcPr>
+            <w:tcW w:w="1080" w:type="dxa"/>
+          </w:tcPr>
+          <w:p>
+            <w:r>
+              <w:t>0.63/0.57</w:t>
+            </w:r>
+          </w:p>
+        </w:tc>
+        <w:tc>
+          <w:tcPr>
+            <w:tcW w:w="1080" w:type="dxa"/>
+          </w:tcPr>
+          <w:p>
+            <w:r>
+              <w:t>0.62/0.55</w:t>
+            </w:r>
+          </w:p>
+        </w:tc>
+        <w:tc>
+          <w:tcPr>
+            <w:tcW w:w="1080" w:type="dxa"/>
+          </w:tcPr>
+          <w:p>
+            <w:r>
+              <w:t>0.61/0.58</w:t>
+            </w:r>
+          </w:p>
+        </w:tc>
+        <w:tc>
+          <w:tcPr>
+            <w:tcW w:w="1080" w:type="dxa"/>
+          </w:tcPr>
+          <w:p>
+            <w:r>
+              <w:t>0.57/0.54</w:t>
+            </w:r>
+          </w:p>
+        </w:tc>
+        <w:tc>
+          <w:tcPr>
+            <w:tcW w:w="1080" w:type="dxa"/>
+          </w:tcPr>
+          <w:p>
+            <w:r>
+              <w:t>0.66/0.52</w:t>
+            </w:r>
+          </w:p>
+        </w:tc>
+        <w:tc>
+          <w:tcPr>
+            <w:tcW w:w="1080" w:type="dxa"/>
+          </w:tcPr>
+          <w:p>
+            <w:r>
+              <w:t>0.66/0.50</w:t>
+            </w:r>
+          </w:p>
+        </w:tc>
+        <w:tc>
+          <w:tcPr>
+            <w:tcW w:w="1080" w:type="dxa"/>
+          </w:tcPr>
+          <w:p>
+            <w:r>
+              <w:t>0.74/0.67</w:t>
+            </w:r>
+          </w:p>
+        </w:tc>
+        <w:tc>
+          <w:tcPr>
+            <w:tcW w:w="1080" w:type="dxa"/>
+          </w:tcPr>
+          <w:p>
+            <w:r>
+              <w:t>0.71/0.61</w:t>
+            </w:r>
+          </w:p>
+        </w:tc>
+      </w:tr>
+      <w:tr>
+        <w:trPr>
+          <w:jc w:val="center"/>
+        </w:trPr>
+        <w:tc>
+          <w:tcPr>
+            <w:tcW w:w="1584" w:type="dxa"/>
+          </w:tcPr>
+          <w:p>
+            <w:r>
+              <w:t>Scalp Region (Isolate)</w:t>
+            </w:r>
+          </w:p>
+        </w:tc>
+        <w:tc>
+          <w:tcPr>
+            <w:tcW w:w="1728" w:type="dxa"/>
+          </w:tcPr>
+          <w:p>
+            <w:r>
+              <w:t>Only Posterior</w:t>
+            </w:r>
+          </w:p>
+        </w:tc>
+        <w:tc>
+          <w:tcPr>
+            <w:tcW w:w="1080" w:type="dxa"/>
+          </w:tcPr>
+          <w:p>
+            <w:r>
+              <w:t>0.61/0.53</w:t>
+            </w:r>
+          </w:p>
+        </w:tc>
+        <w:tc>
+          <w:tcPr>
+            <w:tcW w:w="1080" w:type="dxa"/>
+          </w:tcPr>
+          <w:p>
+            <w:r>
+              <w:t>0.59/0.51</w:t>
+            </w:r>
+          </w:p>
+        </w:tc>
+        <w:tc>
+          <w:tcPr>
+            <w:tcW w:w="1080" w:type="dxa"/>
+          </w:tcPr>
+          <w:p>
+            <w:r>
+              <w:t>0.55/0.52</w:t>
+            </w:r>
+          </w:p>
+        </w:tc>
+        <w:tc>
+          <w:tcPr>
+            <w:tcW w:w="1080" w:type="dxa"/>
+          </w:tcPr>
+          <w:p>
+            <w:r>
+              <w:t>0.54/0.52</w:t>
+            </w:r>
+          </w:p>
+        </w:tc>
+        <w:tc>
+          <w:tcPr>
+            <w:tcW w:w="1080" w:type="dxa"/>
+          </w:tcPr>
+          <w:p>
+            <w:r>
+              <w:t>0.74/0.71</w:t>
+            </w:r>
+          </w:p>
+        </w:tc>
+        <w:tc>
+          <w:tcPr>
+            <w:tcW w:w="1080" w:type="dxa"/>
+          </w:tcPr>
+          <w:p>
+            <w:r>
+              <w:t>0.67/0.67</w:t>
+            </w:r>
+          </w:p>
+        </w:tc>
+        <w:tc>
+          <w:tcPr>
+            <w:tcW w:w="1080" w:type="dxa"/>
+          </w:tcPr>
+          <w:p>
+            <w:r>
+              <w:t>0.67/0.52</w:t>
+            </w:r>
+          </w:p>
+        </w:tc>
+        <w:tc>
+          <w:tcPr>
+            <w:tcW w:w="1080" w:type="dxa"/>
+          </w:tcPr>
+          <w:p>
+            <w:r>
+              <w:t>0.64/0.50</w:t>
+            </w:r>
+          </w:p>
+        </w:tc>
+      </w:tr>
+      <w:tr>
+        <w:trPr>
+          <w:jc w:val="center"/>
+        </w:trPr>
+        <w:tc>
+          <w:tcPr>
+            <w:tcW w:w="1584" w:type="dxa"/>
+          </w:tcPr>
+          <w:p>
+            <w:r>
+              <w:t>Baseline (Band)</w:t>
+            </w:r>
+          </w:p>
+        </w:tc>
+        <w:tc>
+          <w:tcPr>
+            <w:tcW w:w="1728" w:type="dxa"/>
+          </w:tcPr>
+          <w:p>
+            <w:r>
+              <w:t>Full Band Feature Set</w:t>
+            </w:r>
+          </w:p>
+        </w:tc>
+        <w:tc>
+          <w:tcPr>
+            <w:tcW w:w="1080" w:type="dxa"/>
+          </w:tcPr>
+          <w:p>
+            <w:r>
+              <w:t>0.59/0.52</w:t>
+            </w:r>
+          </w:p>
+        </w:tc>
+        <w:tc>
+          <w:tcPr>
+            <w:tcW w:w="1080" w:type="dxa"/>
+          </w:tcPr>
+          <w:p>
+            <w:r>
+              <w:t>0.58/0.53</w:t>
+            </w:r>
+          </w:p>
+        </w:tc>
+        <w:tc>
+          <w:tcPr>
+            <w:tcW w:w="1080" w:type="dxa"/>
+          </w:tcPr>
+          <w:p>
+            <w:r>
+              <w:t>0.57/0.53</w:t>
+            </w:r>
+          </w:p>
+        </w:tc>
+        <w:tc>
+          <w:tcPr>
+            <w:tcW w:w="1080" w:type="dxa"/>
+          </w:tcPr>
+          <w:p>
+            <w:r>
+              <w:t>0.57/0.52</w:t>
+            </w:r>
+          </w:p>
+        </w:tc>
+        <w:tc>
+          <w:tcPr>
+            <w:tcW w:w="1080" w:type="dxa"/>
+          </w:tcPr>
+          <w:p>
+            <w:r>
+              <w:t>0.65/0.60</w:t>
+            </w:r>
+          </w:p>
+        </w:tc>
+        <w:tc>
+          <w:tcPr>
+            <w:tcW w:w="1080" w:type="dxa"/>
+          </w:tcPr>
+          <w:p>
+            <w:r>
+              <w:t>0.63/0.55</w:t>
+            </w:r>
+          </w:p>
+        </w:tc>
+        <w:tc>
+          <w:tcPr>
+            <w:tcW w:w="1080" w:type="dxa"/>
+          </w:tcPr>
+          <w:p>
+            <w:r>
+              <w:t>0.61/0.49</w:t>
+            </w:r>
+          </w:p>
+        </w:tc>
+        <w:tc>
+          <w:tcPr>
+            <w:tcW w:w="1080" w:type="dxa"/>
+          </w:tcPr>
+          <w:p>
+            <w:r>
+              <w:t>0.60/0.47</w:t>
+            </w:r>
+          </w:p>
+        </w:tc>
+      </w:tr>
+      <w:tr>
+        <w:trPr>
+          <w:jc w:val="center"/>
+        </w:trPr>
+        <w:tc>
+          <w:tcPr>
+            <w:tcW w:w="1584" w:type="dxa"/>
+          </w:tcPr>
+          <w:p>
+            <w:r>
+              <w:t>Frequency Band (Omit)</w:t>
+            </w:r>
+          </w:p>
+        </w:tc>
+        <w:tc>
+          <w:tcPr>
+            <w:tcW w:w="1728" w:type="dxa"/>
+          </w:tcPr>
+          <w:p>
+            <w:r>
+              <w:t>Omit Alpha</w:t>
+            </w:r>
+          </w:p>
+        </w:tc>
+        <w:tc>
+          <w:tcPr>
+            <w:tcW w:w="1080" w:type="dxa"/>
+          </w:tcPr>
+          <w:p>
+            <w:r>
+              <w:t>0.59/0.53</w:t>
+            </w:r>
+          </w:p>
+        </w:tc>
+        <w:tc>
+          <w:tcPr>
+            <w:tcW w:w="1080" w:type="dxa"/>
+          </w:tcPr>
+          <w:p>
+            <w:r>
+              <w:t>0.59/0.54</w:t>
+            </w:r>
+          </w:p>
+        </w:tc>
+        <w:tc>
+          <w:tcPr>
+            <w:tcW w:w="1080" w:type="dxa"/>
+          </w:tcPr>
+          <w:p>
+            <w:r>
+              <w:t>0.58/0.55</w:t>
+            </w:r>
+          </w:p>
+        </w:tc>
+        <w:tc>
+          <w:tcPr>
+            <w:tcW w:w="1080" w:type="dxa"/>
+          </w:tcPr>
+          <w:p>
+            <w:r>
+              <w:t>0.56/0.52</w:t>
+            </w:r>
+          </w:p>
+        </w:tc>
+        <w:tc>
+          <w:tcPr>
+            <w:tcW w:w="1080" w:type="dxa"/>
+          </w:tcPr>
+          <w:p>
+            <w:r>
+              <w:t>0.60/0.54</w:t>
+            </w:r>
+          </w:p>
+        </w:tc>
+        <w:tc>
+          <w:tcPr>
+            <w:tcW w:w="1080" w:type="dxa"/>
+          </w:tcPr>
+          <w:p>
+            <w:r>
+              <w:t>0.59/0.50</w:t>
+            </w:r>
+          </w:p>
+        </w:tc>
+        <w:tc>
+          <w:tcPr>
+            <w:tcW w:w="1080" w:type="dxa"/>
+          </w:tcPr>
+          <w:p>
+            <w:r>
+              <w:t>0.59/0.48</w:t>
+            </w:r>
+          </w:p>
+        </w:tc>
+        <w:tc>
+          <w:tcPr>
+            <w:tcW w:w="1080" w:type="dxa"/>
+          </w:tcPr>
+          <w:p>
+            <w:r>
+              <w:t>0.58/0.46</w:t>
+            </w:r>
+          </w:p>
+        </w:tc>
+      </w:tr>
+      <w:tr>
+        <w:trPr>
+          <w:jc w:val="center"/>
+        </w:trPr>
+        <w:tc>
+          <w:tcPr>
+            <w:tcW w:w="1584" w:type="dxa"/>
+          </w:tcPr>
+          <w:p>
+            <w:r>
+              <w:t>Frequency Band (Isolate)</w:t>
+            </w:r>
+          </w:p>
+        </w:tc>
+        <w:tc>
+          <w:tcPr>
+            <w:tcW w:w="1728" w:type="dxa"/>
+          </w:tcPr>
+          <w:p>
+            <w:r>
+              <w:t>Only Alpha</w:t>
+            </w:r>
+          </w:p>
+        </w:tc>
+        <w:tc>
+          <w:tcPr>
+            <w:tcW w:w="1080" w:type="dxa"/>
+          </w:tcPr>
+          <w:p>
+            <w:r>
+              <w:t>0.54/0.52</w:t>
             </w:r>
           </w:p>
         </w:tc>
@@ -768,7 +1193,7 @@
           </w:tcPr>
           <w:p>
             <w:r>
-              <w:t>0.75/0.73</w:t>
+              <w:t>0.55/0.53</w:t>
             </w:r>
           </w:p>
         </w:tc>
@@ -778,7 +1203,7 @@
           </w:tcPr>
           <w:p>
             <w:r>
-              <w:t>0.68/0.69</w:t>
+              <w:t>0.57/0.54</w:t>
             </w:r>
           </w:p>
         </w:tc>
@@ -788,187 +1213,7 @@
           </w:tcPr>
           <w:p>
             <w:r>
-              <w:t>0.75/0.71</w:t>
-            </w:r>
-          </w:p>
-        </w:tc>
-        <w:tc>
-          <w:tcPr>
-            <w:tcW w:w="1080" w:type="dxa"/>
-          </w:tcPr>
-          <w:p>
-            <w:r>
-              <w:t>0.76/0.72</w:t>
-            </w:r>
-          </w:p>
-        </w:tc>
-      </w:tr>
-      <w:tr>
-        <w:trPr>
-          <w:jc w:val="center"/>
-        </w:trPr>
-        <w:tc>
-          <w:tcPr>
-            <w:tcW w:w="1584" w:type="dxa"/>
-          </w:tcPr>
-          <w:p>
-            <w:r>
-              <w:rPr>
-                <w:rFonts w:ascii="Arial" w:hAnsi="Arial"/>
-                <w:color w:val="000000"/>
-                <w:sz w:val="16"/>
-              </w:rPr>
-              <w:t>Feature Family (Isolate)</w:t>
-            </w:r>
-          </w:p>
-        </w:tc>
-        <w:tc>
-          <w:tcPr>
-            <w:tcW w:w="1728" w:type="dxa"/>
-          </w:tcPr>
-          <w:p>
-            <w:r>
-              <w:rPr>
-                <w:rFonts w:ascii="Arial" w:hAnsi="Arial"/>
-                <w:color w:val="000000"/>
-                <w:sz w:val="16"/>
-              </w:rPr>
-              <w:t>Only Spectral</w:t>
-            </w:r>
-          </w:p>
-        </w:tc>
-        <w:tc>
-          <w:tcPr>
-            <w:tcW w:w="1080" w:type="dxa"/>
-          </w:tcPr>
-          <w:p>
-            <w:r>
-              <w:t>0.61/0.53</w:t>
-            </w:r>
-          </w:p>
-        </w:tc>
-        <w:tc>
-          <w:tcPr>
-            <w:tcW w:w="1080" w:type="dxa"/>
-          </w:tcPr>
-          <w:p>
-            <w:r>
-              <w:t>0.60/0.53</w:t>
-            </w:r>
-          </w:p>
-        </w:tc>
-        <w:tc>
-          <w:tcPr>
-            <w:tcW w:w="1080" w:type="dxa"/>
-          </w:tcPr>
-          <w:p>
-            <w:r>
-              <w:t>0.60/0.56</w:t>
-            </w:r>
-          </w:p>
-        </w:tc>
-        <w:tc>
-          <w:tcPr>
-            <w:tcW w:w="1080" w:type="dxa"/>
-          </w:tcPr>
-          <w:p>
-            <w:r>
-              <w:t>0.59/0.56</w:t>
-            </w:r>
-          </w:p>
-        </w:tc>
-        <w:tc>
-          <w:tcPr>
-            <w:tcW w:w="1080" w:type="dxa"/>
-          </w:tcPr>
-          <w:p>
-            <w:r>
-              <w:t>0.71/0.68</w:t>
-            </w:r>
-          </w:p>
-        </w:tc>
-        <w:tc>
-          <w:tcPr>
-            <w:tcW w:w="1080" w:type="dxa"/>
-          </w:tcPr>
-          <w:p>
-            <w:r>
-              <w:t>0.67/0.67</w:t>
-            </w:r>
-          </w:p>
-        </w:tc>
-        <w:tc>
-          <w:tcPr>
-            <w:tcW w:w="1080" w:type="dxa"/>
-          </w:tcPr>
-          <w:p>
-            <w:r>
-              <w:t>0.65/0.59</w:t>
-            </w:r>
-          </w:p>
-        </w:tc>
-        <w:tc>
-          <w:tcPr>
-            <w:tcW w:w="1080" w:type="dxa"/>
-          </w:tcPr>
-          <w:p>
-            <w:r>
-              <w:t>0.68/0.57</w:t>
-            </w:r>
-          </w:p>
-        </w:tc>
-      </w:tr>
-      <w:tr>
-        <w:trPr>
-          <w:jc w:val="center"/>
-        </w:trPr>
-        <w:tc>
-          <w:tcPr>
-            <w:tcW w:w="1584" w:type="dxa"/>
-          </w:tcPr>
-          <w:p>
-            <w:r>
-              <w:rPr>
-                <w:rFonts w:ascii="Arial" w:hAnsi="Arial"/>
-                <w:color w:val="000000"/>
-                <w:sz w:val="16"/>
-              </w:rPr>
-              <w:t>Scalp Region (Isolate)</w:t>
-            </w:r>
-          </w:p>
-        </w:tc>
-        <w:tc>
-          <w:tcPr>
-            <w:tcW w:w="1728" w:type="dxa"/>
-          </w:tcPr>
-          <w:p>
-            <w:r>
-              <w:rPr>
-                <w:rFonts w:ascii="Arial" w:hAnsi="Arial"/>
-                <w:color w:val="000000"/>
-                <w:sz w:val="16"/>
-              </w:rPr>
-              <w:t>Only Central &amp; Temporal</w:t>
-            </w:r>
-          </w:p>
-        </w:tc>
-        <w:tc>
-          <w:tcPr>
-            <w:tcW w:w="1080" w:type="dxa"/>
-          </w:tcPr>
-          <w:p>
-            <w:r>
-              <w:t>0.62/0.55</w:t>
-            </w:r>
-          </w:p>
-        </w:tc>
-        <w:tc>
-          <w:tcPr>
-            <w:tcW w:w="1080" w:type="dxa"/>
-          </w:tcPr>
-          <w:p>
-            <w:r>
-              <w:t>0.62/0.56</w:t>
+              <w:t>0.62/0.57</w:t>
             </w:r>
           </w:p>
         </w:tc>
@@ -998,37 +1243,7 @@
           </w:tcPr>
           <w:p>
             <w:r>
-              <w:t>0.75/0.72</w:t>
-            </w:r>
-          </w:p>
-        </w:tc>
-        <w:tc>
-          <w:tcPr>
-            <w:tcW w:w="1080" w:type="dxa"/>
-          </w:tcPr>
-          <w:p>
-            <w:r>
-              <w:t>0.66/0.64</w:t>
-            </w:r>
-          </w:p>
-        </w:tc>
-        <w:tc>
-          <w:tcPr>
-            <w:tcW w:w="1080" w:type="dxa"/>
-          </w:tcPr>
-          <w:p>
-            <w:r>
-              <w:t>0.70/0.65</w:t>
-            </w:r>
-          </w:p>
-        </w:tc>
-        <w:tc>
-          <w:tcPr>
-            <w:tcW w:w="1080" w:type="dxa"/>
-          </w:tcPr>
-          <w:p>
-            <w:r>
-              <w:t>0.70/0.65</w:t>
+              <w:t>0.56/0.54</w:t>
             </w:r>
           </w:p>
         </w:tc>
@@ -1043,356 +1258,6 @@
           </w:tcPr>
           <w:p>
             <w:r>
-              <w:rPr>
-                <w:rFonts w:ascii="Arial" w:hAnsi="Arial"/>
-                <w:color w:val="000000"/>
-                <w:sz w:val="16"/>
-              </w:rPr>
-              <w:t>Scalp Region (Isolate)</w:t>
-            </w:r>
-          </w:p>
-        </w:tc>
-        <w:tc>
-          <w:tcPr>
-            <w:tcW w:w="1728" w:type="dxa"/>
-          </w:tcPr>
-          <w:p>
-            <w:r>
-              <w:rPr>
-                <w:rFonts w:ascii="Arial" w:hAnsi="Arial"/>
-                <w:color w:val="000000"/>
-                <w:sz w:val="16"/>
-              </w:rPr>
-              <w:t>Only Posterior</w:t>
-            </w:r>
-          </w:p>
-        </w:tc>
-        <w:tc>
-          <w:tcPr>
-            <w:tcW w:w="1080" w:type="dxa"/>
-          </w:tcPr>
-          <w:p>
-            <w:r>
-              <w:t>0.57/0.49</w:t>
-            </w:r>
-          </w:p>
-        </w:tc>
-        <w:tc>
-          <w:tcPr>
-            <w:tcW w:w="1080" w:type="dxa"/>
-          </w:tcPr>
-          <w:p>
-            <w:r>
-              <w:t>0.58/0.50</w:t>
-            </w:r>
-          </w:p>
-        </w:tc>
-        <w:tc>
-          <w:tcPr>
-            <w:tcW w:w="1080" w:type="dxa"/>
-          </w:tcPr>
-          <w:p>
-            <w:r>
-              <w:t>0.57/0.53</w:t>
-            </w:r>
-          </w:p>
-        </w:tc>
-        <w:tc>
-          <w:tcPr>
-            <w:tcW w:w="1080" w:type="dxa"/>
-          </w:tcPr>
-          <w:p>
-            <w:r>
-              <w:t>0.57/0.53</w:t>
-            </w:r>
-          </w:p>
-        </w:tc>
-        <w:tc>
-          <w:tcPr>
-            <w:tcW w:w="1080" w:type="dxa"/>
-          </w:tcPr>
-          <w:p>
-            <w:r>
-              <w:t>0.71/0.67</w:t>
-            </w:r>
-          </w:p>
-        </w:tc>
-        <w:tc>
-          <w:tcPr>
-            <w:tcW w:w="1080" w:type="dxa"/>
-          </w:tcPr>
-          <w:p>
-            <w:r>
-              <w:t>0.67/0.67</w:t>
-            </w:r>
-          </w:p>
-        </w:tc>
-        <w:tc>
-          <w:tcPr>
-            <w:tcW w:w="1080" w:type="dxa"/>
-          </w:tcPr>
-          <w:p>
-            <w:r>
-              <w:t>0.68/0.56</w:t>
-            </w:r>
-          </w:p>
-        </w:tc>
-        <w:tc>
-          <w:tcPr>
-            <w:tcW w:w="1080" w:type="dxa"/>
-          </w:tcPr>
-          <w:p>
-            <w:r>
-              <w:t>0.63/0.60</w:t>
-            </w:r>
-          </w:p>
-        </w:tc>
-      </w:tr>
-      <w:tr>
-        <w:trPr>
-          <w:jc w:val="center"/>
-        </w:trPr>
-        <w:tc>
-          <w:tcPr>
-            <w:tcW w:w="1584" w:type="dxa"/>
-          </w:tcPr>
-          <w:p>
-            <w:r>
-              <w:rPr>
-                <w:rFonts w:ascii="Arial" w:hAnsi="Arial"/>
-                <w:color w:val="000000"/>
-                <w:sz w:val="16"/>
-              </w:rPr>
-              <w:t>Baseline (Band)</w:t>
-            </w:r>
-          </w:p>
-        </w:tc>
-        <w:tc>
-          <w:tcPr>
-            <w:tcW w:w="1728" w:type="dxa"/>
-          </w:tcPr>
-          <w:p>
-            <w:r>
-              <w:rPr>
-                <w:rFonts w:ascii="Arial" w:hAnsi="Arial"/>
-                <w:color w:val="000000"/>
-                <w:sz w:val="16"/>
-              </w:rPr>
-              <w:t>Full Band Feature Set</w:t>
-            </w:r>
-          </w:p>
-        </w:tc>
-        <w:tc>
-          <w:tcPr>
-            <w:tcW w:w="1080" w:type="dxa"/>
-          </w:tcPr>
-          <w:p>
-            <w:r>
-              <w:t>0.59/0.53</w:t>
-            </w:r>
-          </w:p>
-        </w:tc>
-        <w:tc>
-          <w:tcPr>
-            <w:tcW w:w="1080" w:type="dxa"/>
-          </w:tcPr>
-          <w:p>
-            <w:r>
-              <w:t>0.60/0.53</w:t>
-            </w:r>
-          </w:p>
-        </w:tc>
-        <w:tc>
-          <w:tcPr>
-            <w:tcW w:w="1080" w:type="dxa"/>
-          </w:tcPr>
-          <w:p>
-            <w:r>
-              <w:t>0.59/0.55</w:t>
-            </w:r>
-          </w:p>
-        </w:tc>
-        <w:tc>
-          <w:tcPr>
-            <w:tcW w:w="1080" w:type="dxa"/>
-          </w:tcPr>
-          <w:p>
-            <w:r>
-              <w:t>0.59/0.56</w:t>
-            </w:r>
-          </w:p>
-        </w:tc>
-        <w:tc>
-          <w:tcPr>
-            <w:tcW w:w="1080" w:type="dxa"/>
-          </w:tcPr>
-          <w:p>
-            <w:r>
-              <w:t>0.65/0.59</w:t>
-            </w:r>
-          </w:p>
-        </w:tc>
-        <w:tc>
-          <w:tcPr>
-            <w:tcW w:w="1080" w:type="dxa"/>
-          </w:tcPr>
-          <w:p>
-            <w:r>
-              <w:t>0.62/0.56</w:t>
-            </w:r>
-          </w:p>
-        </w:tc>
-        <w:tc>
-          <w:tcPr>
-            <w:tcW w:w="1080" w:type="dxa"/>
-          </w:tcPr>
-          <w:p>
-            <w:r>
-              <w:t>0.62/0.42</w:t>
-            </w:r>
-          </w:p>
-        </w:tc>
-        <w:tc>
-          <w:tcPr>
-            <w:tcW w:w="1080" w:type="dxa"/>
-          </w:tcPr>
-          <w:p>
-            <w:r>
-              <w:t>0.61/0.43</w:t>
-            </w:r>
-          </w:p>
-        </w:tc>
-      </w:tr>
-      <w:tr>
-        <w:trPr>
-          <w:jc w:val="center"/>
-        </w:trPr>
-        <w:tc>
-          <w:tcPr>
-            <w:tcW w:w="1584" w:type="dxa"/>
-          </w:tcPr>
-          <w:p>
-            <w:r>
-              <w:rPr>
-                <w:rFonts w:ascii="Arial" w:hAnsi="Arial"/>
-                <w:color w:val="000000"/>
-                <w:sz w:val="16"/>
-              </w:rPr>
-              <w:t>Frequency Band (Omit)</w:t>
-            </w:r>
-          </w:p>
-        </w:tc>
-        <w:tc>
-          <w:tcPr>
-            <w:tcW w:w="1728" w:type="dxa"/>
-          </w:tcPr>
-          <w:p>
-            <w:r>
-              <w:rPr>
-                <w:rFonts w:ascii="Arial" w:hAnsi="Arial"/>
-                <w:color w:val="000000"/>
-                <w:sz w:val="16"/>
-              </w:rPr>
-              <w:t>Omit Alpha</w:t>
-            </w:r>
-          </w:p>
-        </w:tc>
-        <w:tc>
-          <w:tcPr>
-            <w:tcW w:w="1080" w:type="dxa"/>
-          </w:tcPr>
-          <w:p>
-            <w:r>
-              <w:t>0.59/0.52</w:t>
-            </w:r>
-          </w:p>
-        </w:tc>
-        <w:tc>
-          <w:tcPr>
-            <w:tcW w:w="1080" w:type="dxa"/>
-          </w:tcPr>
-          <w:p>
-            <w:r>
-              <w:t>0.60/0.54</w:t>
-            </w:r>
-          </w:p>
-        </w:tc>
-        <w:tc>
-          <w:tcPr>
-            <w:tcW w:w="1080" w:type="dxa"/>
-          </w:tcPr>
-          <w:p>
-            <w:r>
-              <w:t>0.59/0.56</w:t>
-            </w:r>
-          </w:p>
-        </w:tc>
-        <w:tc>
-          <w:tcPr>
-            <w:tcW w:w="1080" w:type="dxa"/>
-          </w:tcPr>
-          <w:p>
-            <w:r>
-              <w:t>0.58/0.56</w:t>
-            </w:r>
-          </w:p>
-        </w:tc>
-        <w:tc>
-          <w:tcPr>
-            <w:tcW w:w="1080" w:type="dxa"/>
-          </w:tcPr>
-          <w:p>
-            <w:r>
-              <w:t>0.59/0.56</w:t>
-            </w:r>
-          </w:p>
-        </w:tc>
-        <w:tc>
-          <w:tcPr>
-            <w:tcW w:w="1080" w:type="dxa"/>
-          </w:tcPr>
-          <w:p>
-            <w:r>
-              <w:t>0.56/0.48</w:t>
-            </w:r>
-          </w:p>
-        </w:tc>
-        <w:tc>
-          <w:tcPr>
-            <w:tcW w:w="1080" w:type="dxa"/>
-          </w:tcPr>
-          <w:p>
-            <w:r>
-              <w:t>0.59/0.44</w:t>
-            </w:r>
-          </w:p>
-        </w:tc>
-        <w:tc>
-          <w:tcPr>
-            <w:tcW w:w="1080" w:type="dxa"/>
-          </w:tcPr>
-          <w:p>
-            <w:r>
-              <w:t>0.57/0.41</w:t>
-            </w:r>
-          </w:p>
-        </w:tc>
-      </w:tr>
-      <w:tr>
-        <w:trPr>
-          <w:jc w:val="center"/>
-        </w:trPr>
-        <w:tc>
-          <w:tcPr>
-            <w:tcW w:w="1584" w:type="dxa"/>
-          </w:tcPr>
-          <w:p>
-            <w:r>
-              <w:rPr>
-                <w:rFonts w:ascii="Arial" w:hAnsi="Arial"/>
-                <w:color w:val="000000"/>
-                <w:sz w:val="16"/>
-              </w:rPr>
               <w:t>Frequency Band (Isolate)</w:t>
             </w:r>
           </w:p>
@@ -1403,126 +1268,6 @@
           </w:tcPr>
           <w:p>
             <w:r>
-              <w:rPr>
-                <w:rFonts w:ascii="Arial" w:hAnsi="Arial"/>
-                <w:color w:val="000000"/>
-                <w:sz w:val="16"/>
-              </w:rPr>
-              <w:t>Only Alpha</w:t>
-            </w:r>
-          </w:p>
-        </w:tc>
-        <w:tc>
-          <w:tcPr>
-            <w:tcW w:w="1080" w:type="dxa"/>
-          </w:tcPr>
-          <w:p>
-            <w:r>
-              <w:t>0.55/0.52</w:t>
-            </w:r>
-          </w:p>
-        </w:tc>
-        <w:tc>
-          <w:tcPr>
-            <w:tcW w:w="1080" w:type="dxa"/>
-          </w:tcPr>
-          <w:p>
-            <w:r>
-              <w:t>0.55/0.50</w:t>
-            </w:r>
-          </w:p>
-        </w:tc>
-        <w:tc>
-          <w:tcPr>
-            <w:tcW w:w="1080" w:type="dxa"/>
-          </w:tcPr>
-          <w:p>
-            <w:r>
-              <w:t>0.55/0.54</w:t>
-            </w:r>
-          </w:p>
-        </w:tc>
-        <w:tc>
-          <w:tcPr>
-            <w:tcW w:w="1080" w:type="dxa"/>
-          </w:tcPr>
-          <w:p>
-            <w:r>
-              <w:t>0.56/0.54</w:t>
-            </w:r>
-          </w:p>
-        </w:tc>
-        <w:tc>
-          <w:tcPr>
-            <w:tcW w:w="1080" w:type="dxa"/>
-          </w:tcPr>
-          <w:p>
-            <w:r>
-              <w:t>0.64/0.54</w:t>
-            </w:r>
-          </w:p>
-        </w:tc>
-        <w:tc>
-          <w:tcPr>
-            <w:tcW w:w="1080" w:type="dxa"/>
-          </w:tcPr>
-          <w:p>
-            <w:r>
-              <w:t>0.59/0.53</w:t>
-            </w:r>
-          </w:p>
-        </w:tc>
-        <w:tc>
-          <w:tcPr>
-            <w:tcW w:w="1080" w:type="dxa"/>
-          </w:tcPr>
-          <w:p>
-            <w:r>
-              <w:t>0.62/0.56</w:t>
-            </w:r>
-          </w:p>
-        </w:tc>
-        <w:tc>
-          <w:tcPr>
-            <w:tcW w:w="1080" w:type="dxa"/>
-          </w:tcPr>
-          <w:p>
-            <w:r>
-              <w:t>0.57/0.53</w:t>
-            </w:r>
-          </w:p>
-        </w:tc>
-      </w:tr>
-      <w:tr>
-        <w:trPr>
-          <w:jc w:val="center"/>
-        </w:trPr>
-        <w:tc>
-          <w:tcPr>
-            <w:tcW w:w="1584" w:type="dxa"/>
-          </w:tcPr>
-          <w:p>
-            <w:r>
-              <w:rPr>
-                <w:rFonts w:ascii="Arial" w:hAnsi="Arial"/>
-                <w:color w:val="000000"/>
-                <w:sz w:val="16"/>
-              </w:rPr>
-              <w:t>Frequency Band (Isolate)</w:t>
-            </w:r>
-          </w:p>
-        </w:tc>
-        <w:tc>
-          <w:tcPr>
-            <w:tcW w:w="1728" w:type="dxa"/>
-          </w:tcPr>
-          <w:p>
-            <w:r>
-              <w:rPr>
-                <w:rFonts w:ascii="Arial" w:hAnsi="Arial"/>
-                <w:color w:val="000000"/>
-                <w:sz w:val="16"/>
-              </w:rPr>
               <w:t>Only Theta</w:t>
             </w:r>
           </w:p>
@@ -1533,7 +1278,7 @@
           </w:tcPr>
           <w:p>
             <w:r>
-              <w:t>0.59/0.52</w:t>
+              <w:t>0.60/0.51</w:t>
             </w:r>
           </w:p>
         </w:tc>
@@ -1543,7 +1288,7 @@
           </w:tcPr>
           <w:p>
             <w:r>
-              <w:t>0.59/0.49</w:t>
+              <w:t>0.60/0.49</w:t>
             </w:r>
           </w:p>
         </w:tc>
@@ -1553,7 +1298,7 @@
           </w:tcPr>
           <w:p>
             <w:r>
-              <w:t>0.57/0.53</w:t>
+              <w:t>0.56/0.52</w:t>
             </w:r>
           </w:p>
         </w:tc>
@@ -1563,7 +1308,7 @@
           </w:tcPr>
           <w:p>
             <w:r>
-              <w:t>0.58/0.54</w:t>
+              <w:t>0.58/0.53</w:t>
             </w:r>
           </w:p>
         </w:tc>
@@ -1573,7 +1318,7 @@
           </w:tcPr>
           <w:p>
             <w:r>
-              <w:t>0.57/0.54</w:t>
+              <w:t>0.55/0.49</w:t>
             </w:r>
           </w:p>
         </w:tc>
@@ -1583,7 +1328,7 @@
           </w:tcPr>
           <w:p>
             <w:r>
-              <w:t>0.54/0.46</w:t>
+              <w:t>0.55/0.49</w:t>
             </w:r>
           </w:p>
         </w:tc>
@@ -1593,7 +1338,7 @@
           </w:tcPr>
           <w:p>
             <w:r>
-              <w:t>0.56/0.54</w:t>
+              <w:t>0.56/0.52</w:t>
             </w:r>
           </w:p>
         </w:tc>
@@ -1603,13 +1348,17 @@
           </w:tcPr>
           <w:p>
             <w:r>
-              <w:t>0.55/0.50</w:t>
+              <w:t>0.58/0.53</w:t>
             </w:r>
           </w:p>
         </w:tc>
       </w:tr>
     </w:tbl>
-    <w:p/>
+    <w:p>
+      <w:r>
+        <w:t>–</w:t>
+      </w:r>
+    </w:p>
     <w:sectPr>
       <w:pgSz w:w="12240" w:h="15840"/>
       <w:pgMar w:top="1152" w:right="1152" w:bottom="1152" w:left="1152" w:header="720" w:footer="720" w:gutter="0"/>

</xml_diff>